<commit_message>
SQD file for Riga
</commit_message>
<xml_diff>
--- a/Documentation/SquareDeal.docx
+++ b/Documentation/SquareDeal.docx
@@ -9,19 +9,11 @@
           <w:lang w:val="en-US"/>
         </w:rPr>
       </w:pPr>
-      <w:proofErr w:type="spellStart"/>
-      <w:r>
-        <w:rPr>
-          <w:lang w:val="en-US"/>
-        </w:rPr>
-        <w:t>SquareDeal</w:t>
-      </w:r>
-      <w:proofErr w:type="spellEnd"/>
-      <w:r>
-        <w:rPr>
-          <w:lang w:val="en-US"/>
-        </w:rPr>
-        <w:t>: Tournament Hand Management Software</w:t>
+      <w:r>
+        <w:rPr>
+          <w:lang w:val="en-US"/>
+        </w:rPr>
+        <w:t>SquareDeal: Tournament Hand Management Software</w:t>
       </w:r>
     </w:p>
     <w:p>
@@ -73,19 +65,11 @@
           <w:lang w:val="en-US"/>
         </w:rPr>
       </w:pPr>
-      <w:proofErr w:type="spellStart"/>
-      <w:r>
-        <w:rPr>
-          <w:lang w:val="en-US"/>
-        </w:rPr>
-        <w:t>SquareDeal</w:t>
-      </w:r>
-      <w:proofErr w:type="spellEnd"/>
-      <w:r>
-        <w:rPr>
-          <w:lang w:val="en-US"/>
-        </w:rPr>
-        <w:t xml:space="preserve"> is a piece of software for people that make sets of bridge hands for </w:t>
+      <w:r>
+        <w:rPr>
+          <w:lang w:val="en-US"/>
+        </w:rPr>
+        <w:t xml:space="preserve">SquareDeal is a piece of software for people that make sets of bridge hands for </w:t>
       </w:r>
       <w:r>
         <w:rPr>
@@ -97,21 +81,7 @@
         <w:rPr>
           <w:lang w:val="en-US"/>
         </w:rPr>
-        <w:t xml:space="preserve">tournaments. It uses the well-known program </w:t>
-      </w:r>
-      <w:proofErr w:type="spellStart"/>
-      <w:r>
-        <w:rPr>
-          <w:lang w:val="en-US"/>
-        </w:rPr>
-        <w:t>BigDeal</w:t>
-      </w:r>
-      <w:proofErr w:type="spellEnd"/>
-      <w:r>
-        <w:rPr>
-          <w:lang w:val="en-US"/>
-        </w:rPr>
-        <w:t xml:space="preserve"> for actual dealing, but adds two things:</w:t>
+        <w:t>tournaments. It uses the well-known program BigDeal for actual dealing, but adds two things:</w:t>
       </w:r>
     </w:p>
     <w:p>
@@ -153,86 +123,123 @@
         <w:rPr>
           <w:lang w:val="en-US"/>
         </w:rPr>
-        <w:t xml:space="preserve">A way for participants to check the hands </w:t>
-      </w:r>
-      <w:proofErr w:type="gramStart"/>
-      <w:r>
-        <w:rPr>
-          <w:lang w:val="en-US"/>
-        </w:rPr>
-        <w:t>were</w:t>
-      </w:r>
-      <w:proofErr w:type="gramEnd"/>
+        <w:t xml:space="preserve">A way for participants to check the hands were dealt honestly and without any tricks by the </w:t>
+      </w:r>
+      <w:r>
+        <w:rPr>
+          <w:lang w:val="en-US"/>
+        </w:rPr>
+        <w:t>organizer.</w:t>
+      </w:r>
+    </w:p>
+    <w:p>
+      <w:pPr>
+        <w:rPr>
+          <w:lang w:val="en-US"/>
+        </w:rPr>
+      </w:pPr>
+      <w:r>
+        <w:rPr>
+          <w:lang w:val="en-US"/>
+        </w:rPr>
+        <w:t xml:space="preserve">Using SquareDeal </w:t>
+      </w:r>
+      <w:r>
+        <w:rPr>
+          <w:lang w:val="en-US"/>
+        </w:rPr>
+        <w:t xml:space="preserve">a specific procedure is needed, </w:t>
+      </w:r>
+      <w:r>
+        <w:rPr>
+          <w:lang w:val="en-US"/>
+        </w:rPr>
+        <w:t>in</w:t>
+      </w:r>
+      <w:r>
+        <w:rPr>
+          <w:lang w:val="en-US"/>
+        </w:rPr>
+        <w:t xml:space="preserve"> various </w:t>
+      </w:r>
+      <w:r>
+        <w:rPr>
+          <w:lang w:val="en-US"/>
+        </w:rPr>
+        <w:t>periods</w:t>
+      </w:r>
+      <w:r>
+        <w:rPr>
+          <w:lang w:val="en-US"/>
+        </w:rPr>
+        <w:t xml:space="preserve">, by organizer and participants. There is no actual need for participants to do anything, but if they want to check the hands after the </w:t>
+      </w:r>
+      <w:r>
+        <w:rPr>
+          <w:lang w:val="en-US"/>
+        </w:rPr>
+        <w:t>tournament,</w:t>
+      </w:r>
       <w:r>
         <w:rPr>
           <w:lang w:val="en-US"/>
         </w:rPr>
         <w:t xml:space="preserve"> </w:t>
       </w:r>
-      <w:proofErr w:type="gramStart"/>
-      <w:r>
-        <w:rPr>
-          <w:lang w:val="en-US"/>
-        </w:rPr>
-        <w:t>dealt</w:t>
-      </w:r>
-      <w:proofErr w:type="gramEnd"/>
-      <w:r>
-        <w:rPr>
-          <w:lang w:val="en-US"/>
-        </w:rPr>
-        <w:t xml:space="preserve"> honestly and without any tricks by the </w:t>
-      </w:r>
-      <w:r>
-        <w:rPr>
-          <w:lang w:val="en-US"/>
-        </w:rPr>
-        <w:t>organizer.</w:t>
-      </w:r>
-    </w:p>
-    <w:p>
-      <w:pPr>
-        <w:rPr>
-          <w:lang w:val="en-US"/>
-        </w:rPr>
-      </w:pPr>
-      <w:r>
-        <w:rPr>
-          <w:lang w:val="en-US"/>
-        </w:rPr>
-        <w:t xml:space="preserve">Using </w:t>
-      </w:r>
-      <w:proofErr w:type="spellStart"/>
-      <w:r>
-        <w:rPr>
-          <w:lang w:val="en-US"/>
-        </w:rPr>
-        <w:t>SquareDeal</w:t>
-      </w:r>
-      <w:proofErr w:type="spellEnd"/>
-      <w:r>
-        <w:rPr>
-          <w:lang w:val="en-US"/>
-        </w:rPr>
-        <w:t xml:space="preserve"> </w:t>
-      </w:r>
-      <w:r>
-        <w:rPr>
-          <w:lang w:val="en-US"/>
-        </w:rPr>
-        <w:t xml:space="preserve">a specific procedure is needed, </w:t>
-      </w:r>
-      <w:r>
-        <w:rPr>
-          <w:lang w:val="en-US"/>
-        </w:rPr>
-        <w:t>in</w:t>
-      </w:r>
-      <w:r>
-        <w:rPr>
-          <w:lang w:val="en-US"/>
-        </w:rPr>
-        <w:t xml:space="preserve"> various </w:t>
+      <w:r>
+        <w:rPr>
+          <w:lang w:val="en-US"/>
+        </w:rPr>
+        <w:t>at least some of them</w:t>
+      </w:r>
+      <w:r>
+        <w:rPr>
+          <w:lang w:val="en-US"/>
+        </w:rPr>
+        <w:t xml:space="preserve"> need to do something even before the tournament.</w:t>
+      </w:r>
+      <w:r>
+        <w:rPr>
+          <w:lang w:val="en-US"/>
+        </w:rPr>
+        <w:t xml:space="preserve"> If you only want to use SquareDeal for</w:t>
+      </w:r>
+      <w:r>
+        <w:rPr>
+          <w:lang w:val="en-US"/>
+        </w:rPr>
+        <w:t xml:space="preserve"> the first of the </w:t>
+      </w:r>
+      <w:r>
+        <w:rPr>
+          <w:lang w:val="en-US"/>
+        </w:rPr>
+        <w:t>objectives,</w:t>
+      </w:r>
+      <w:r>
+        <w:rPr>
+          <w:lang w:val="en-US"/>
+        </w:rPr>
+        <w:t xml:space="preserve"> you can ignore</w:t>
+      </w:r>
+      <w:r>
+        <w:rPr>
+          <w:lang w:val="en-US"/>
+        </w:rPr>
+        <w:t xml:space="preserve"> all the timing and publishing stuff.</w:t>
+      </w:r>
+    </w:p>
+    <w:p>
+      <w:pPr>
+        <w:rPr>
+          <w:lang w:val="en-US"/>
+        </w:rPr>
+      </w:pPr>
+      <w:r>
+        <w:rPr>
+          <w:lang w:val="en-US"/>
+        </w:rPr>
+        <w:t xml:space="preserve">I will describe the </w:t>
       </w:r>
       <w:r>
         <w:rPr>
@@ -244,102 +251,55 @@
         <w:rPr>
           <w:lang w:val="en-US"/>
         </w:rPr>
-        <w:t xml:space="preserve">, by organizer and participants. There is no actual need for participants to do anything, but if they want to check </w:t>
-      </w:r>
-      <w:proofErr w:type="gramStart"/>
-      <w:r>
-        <w:rPr>
-          <w:lang w:val="en-US"/>
-        </w:rPr>
-        <w:t>the</w:t>
-      </w:r>
-      <w:proofErr w:type="gramEnd"/>
-      <w:r>
-        <w:rPr>
-          <w:lang w:val="en-US"/>
-        </w:rPr>
-        <w:t xml:space="preserve"> hands after the </w:t>
-      </w:r>
-      <w:r>
-        <w:rPr>
-          <w:lang w:val="en-US"/>
-        </w:rPr>
-        <w:t>tournament,</w:t>
-      </w:r>
-      <w:r>
-        <w:rPr>
-          <w:lang w:val="en-US"/>
-        </w:rPr>
-        <w:t xml:space="preserve"> </w:t>
-      </w:r>
-      <w:r>
-        <w:rPr>
-          <w:lang w:val="en-US"/>
-        </w:rPr>
-        <w:t>at least some of them</w:t>
-      </w:r>
-      <w:r>
-        <w:rPr>
-          <w:lang w:val="en-US"/>
-        </w:rPr>
-        <w:t xml:space="preserve"> need to do something even before the tournament.</w:t>
-      </w:r>
-      <w:r>
-        <w:rPr>
-          <w:lang w:val="en-US"/>
-        </w:rPr>
-        <w:t xml:space="preserve"> If you only want to use </w:t>
-      </w:r>
-      <w:proofErr w:type="spellStart"/>
-      <w:r>
-        <w:rPr>
-          <w:lang w:val="en-US"/>
-        </w:rPr>
-        <w:t>SquareDeal</w:t>
-      </w:r>
-      <w:proofErr w:type="spellEnd"/>
-      <w:r>
-        <w:rPr>
-          <w:lang w:val="en-US"/>
-        </w:rPr>
-        <w:t xml:space="preserve"> for</w:t>
-      </w:r>
-      <w:r>
-        <w:rPr>
-          <w:lang w:val="en-US"/>
-        </w:rPr>
-        <w:t xml:space="preserve"> the first of the </w:t>
-      </w:r>
-      <w:r>
-        <w:rPr>
-          <w:lang w:val="en-US"/>
-        </w:rPr>
-        <w:t>objectives,</w:t>
-      </w:r>
-      <w:r>
-        <w:rPr>
-          <w:lang w:val="en-US"/>
-        </w:rPr>
-        <w:t xml:space="preserve"> you can ignore</w:t>
-      </w:r>
-      <w:r>
-        <w:rPr>
-          <w:lang w:val="en-US"/>
-        </w:rPr>
-        <w:t xml:space="preserve"> all the timing and publishing stuff.</w:t>
-      </w:r>
-    </w:p>
-    <w:p>
-      <w:pPr>
-        <w:rPr>
-          <w:lang w:val="en-US"/>
-        </w:rPr>
-      </w:pPr>
-      <w:r>
-        <w:rPr>
-          <w:lang w:val="en-US"/>
-        </w:rPr>
-        <w:t xml:space="preserve">I will describe the </w:t>
+        <w:t xml:space="preserve"> and </w:t>
+      </w:r>
+      <w:r>
+        <w:rPr>
+          <w:lang w:val="en-US"/>
+        </w:rPr>
+        <w:t>for</w:t>
+      </w:r>
+      <w:r>
+        <w:rPr>
+          <w:lang w:val="en-US"/>
+        </w:rPr>
+        <w:t xml:space="preserve"> each </w:t>
+      </w:r>
+      <w:r>
+        <w:rPr>
+          <w:lang w:val="en-US"/>
+        </w:rPr>
+        <w:t>period</w:t>
+      </w:r>
+      <w:r>
+        <w:rPr>
+          <w:lang w:val="en-US"/>
+        </w:rPr>
+        <w:t xml:space="preserve"> I describe some parts of the software and/or procedures relevant </w:t>
+      </w:r>
+      <w:r>
+        <w:rPr>
+          <w:lang w:val="en-US"/>
+        </w:rPr>
+        <w:t>to</w:t>
+      </w:r>
+      <w:r>
+        <w:rPr>
+          <w:lang w:val="en-US"/>
+        </w:rPr>
+        <w:t xml:space="preserve"> that </w:t>
+      </w:r>
+      <w:r>
+        <w:rPr>
+          <w:lang w:val="en-US"/>
+        </w:rPr>
+        <w:t>period</w:t>
+      </w:r>
+      <w:r>
+        <w:rPr>
+          <w:lang w:val="en-US"/>
+        </w:rPr>
+        <w:t xml:space="preserve">. The </w:t>
       </w:r>
       <w:r>
         <w:rPr>
@@ -351,66 +311,6 @@
         <w:rPr>
           <w:lang w:val="en-US"/>
         </w:rPr>
-        <w:t xml:space="preserve"> and </w:t>
-      </w:r>
-      <w:r>
-        <w:rPr>
-          <w:lang w:val="en-US"/>
-        </w:rPr>
-        <w:t>for</w:t>
-      </w:r>
-      <w:r>
-        <w:rPr>
-          <w:lang w:val="en-US"/>
-        </w:rPr>
-        <w:t xml:space="preserve"> each </w:t>
-      </w:r>
-      <w:r>
-        <w:rPr>
-          <w:lang w:val="en-US"/>
-        </w:rPr>
-        <w:t>period</w:t>
-      </w:r>
-      <w:r>
-        <w:rPr>
-          <w:lang w:val="en-US"/>
-        </w:rPr>
-        <w:t xml:space="preserve"> I describe some parts of the software and/or procedures relevant </w:t>
-      </w:r>
-      <w:r>
-        <w:rPr>
-          <w:lang w:val="en-US"/>
-        </w:rPr>
-        <w:t>to</w:t>
-      </w:r>
-      <w:r>
-        <w:rPr>
-          <w:lang w:val="en-US"/>
-        </w:rPr>
-        <w:t xml:space="preserve"> that </w:t>
-      </w:r>
-      <w:r>
-        <w:rPr>
-          <w:lang w:val="en-US"/>
-        </w:rPr>
-        <w:t>period</w:t>
-      </w:r>
-      <w:r>
-        <w:rPr>
-          <w:lang w:val="en-US"/>
-        </w:rPr>
-        <w:t xml:space="preserve">. The </w:t>
-      </w:r>
-      <w:r>
-        <w:rPr>
-          <w:lang w:val="en-US"/>
-        </w:rPr>
-        <w:t>periods</w:t>
-      </w:r>
-      <w:r>
-        <w:rPr>
-          <w:lang w:val="en-US"/>
-        </w:rPr>
         <w:t xml:space="preserve"> follow each other in time, so </w:t>
       </w:r>
       <w:r>
@@ -437,7 +337,6 @@
         </w:rPr>
         <w:t xml:space="preserve"> performs two different functions, separated by the </w:t>
       </w:r>
-      <w:proofErr w:type="gramStart"/>
       <w:r>
         <w:rPr>
           <w:i/>
@@ -446,7 +345,6 @@
         </w:rPr>
         <w:t>publish</w:t>
       </w:r>
-      <w:proofErr w:type="gramEnd"/>
       <w:r>
         <w:rPr>
           <w:lang w:val="en-US"/>
@@ -542,21 +440,7 @@
         <w:rPr>
           <w:lang w:val="en-US"/>
         </w:rPr>
-        <w:t xml:space="preserve"> It uses a modified </w:t>
-      </w:r>
-      <w:proofErr w:type="spellStart"/>
-      <w:r>
-        <w:rPr>
-          <w:lang w:val="en-US"/>
-        </w:rPr>
-        <w:t>bigdealx</w:t>
-      </w:r>
-      <w:proofErr w:type="spellEnd"/>
-      <w:r>
-        <w:rPr>
-          <w:lang w:val="en-US"/>
-        </w:rPr>
-        <w:t xml:space="preserve">, called </w:t>
+        <w:t xml:space="preserve"> It uses a modified bigdealx, called </w:t>
       </w:r>
       <w:r>
         <w:rPr>
@@ -708,21 +592,7 @@
         <w:rPr>
           <w:lang w:val="en-US"/>
         </w:rPr>
-        <w:t xml:space="preserve">He starts up </w:t>
-      </w:r>
-      <w:proofErr w:type="spellStart"/>
-      <w:r>
-        <w:rPr>
-          <w:lang w:val="en-US"/>
-        </w:rPr>
-        <w:t>SquareDeal</w:t>
-      </w:r>
-      <w:proofErr w:type="spellEnd"/>
-      <w:r>
-        <w:rPr>
-          <w:lang w:val="en-US"/>
-        </w:rPr>
-        <w:t xml:space="preserve"> and tells it a new tournament is coming. He needs to supply a short name, to be used as filename prefix. Let us be original in this document and call it </w:t>
+        <w:t xml:space="preserve">He starts up SquareDeal and tells it a new tournament is coming. He needs to supply a short name, to be used as filename prefix. Let us be original in this document and call it </w:t>
       </w:r>
       <w:r>
         <w:rPr>
@@ -749,7 +619,6 @@
         </w:rPr>
         <w:t xml:space="preserve"> make two files, </w:t>
       </w:r>
-      <w:proofErr w:type="spellStart"/>
       <w:r>
         <w:rPr>
           <w:i/>
@@ -757,14 +626,12 @@
         </w:rPr>
         <w:t>test.sqd</w:t>
       </w:r>
-      <w:proofErr w:type="spellEnd"/>
       <w:r>
         <w:rPr>
           <w:lang w:val="en-US"/>
         </w:rPr>
         <w:t xml:space="preserve">, which contains the description of the tournament and will be published before the tournament and </w:t>
       </w:r>
-      <w:proofErr w:type="spellStart"/>
       <w:r>
         <w:rPr>
           <w:i/>
@@ -772,7 +639,6 @@
         </w:rPr>
         <w:t>test.sqk</w:t>
       </w:r>
-      <w:proofErr w:type="spellEnd"/>
       <w:r>
         <w:rPr>
           <w:lang w:val="en-US"/>
@@ -786,19 +652,11 @@
           <w:lang w:val="en-US"/>
         </w:rPr>
       </w:pPr>
-      <w:proofErr w:type="spellStart"/>
-      <w:r>
-        <w:rPr>
-          <w:lang w:val="en-US"/>
-        </w:rPr>
-        <w:t>Squaredeal</w:t>
-      </w:r>
-      <w:proofErr w:type="spellEnd"/>
-      <w:r>
-        <w:rPr>
-          <w:lang w:val="en-US"/>
-        </w:rPr>
-        <w:t xml:space="preserve"> has two sets of functions, the first before publishing and the next after it.</w:t>
+      <w:r>
+        <w:rPr>
+          <w:lang w:val="en-US"/>
+        </w:rPr>
+        <w:t>Squaredeal has two sets of functions, the first before publishing and the next after it.</w:t>
       </w:r>
       <w:r>
         <w:rPr>
@@ -1047,41 +905,13 @@
         <w:rPr>
           <w:lang w:val="en-US"/>
         </w:rPr>
-        <w:t xml:space="preserve">It is also allowed to give </w:t>
-      </w:r>
-      <w:proofErr w:type="gramStart"/>
-      <w:r>
-        <w:rPr>
-          <w:lang w:val="en-US"/>
-        </w:rPr>
-        <w:t>a ?</w:t>
-      </w:r>
-      <w:proofErr w:type="gramEnd"/>
-      <w:r>
-        <w:rPr>
-          <w:lang w:val="en-US"/>
-        </w:rPr>
-        <w:t xml:space="preserve"> as the number of boards. This signifies that you are not sure yet</w:t>
-      </w:r>
-      <w:r>
-        <w:rPr>
-          <w:lang w:val="en-US"/>
-        </w:rPr>
-        <w:t xml:space="preserve">. When making hands </w:t>
-      </w:r>
-      <w:proofErr w:type="gramStart"/>
-      <w:r>
-        <w:rPr>
-          <w:lang w:val="en-US"/>
-        </w:rPr>
-        <w:t>for</w:t>
-      </w:r>
-      <w:proofErr w:type="gramEnd"/>
-      <w:r>
-        <w:rPr>
-          <w:lang w:val="en-US"/>
-        </w:rPr>
-        <w:t xml:space="preserve"> this phase you will be prompted for the number of boards.</w:t>
+        <w:t>It is also allowed to give a ? as the number of boards. This signifies that you are not sure yet</w:t>
+      </w:r>
+      <w:r>
+        <w:rPr>
+          <w:lang w:val="en-US"/>
+        </w:rPr>
+        <w:t>. When making hands for this phase you will be prompted for the number of boards.</w:t>
       </w:r>
     </w:p>
     <w:p>
@@ -1117,21 +947,7 @@
         <w:rPr>
           <w:lang w:val="en-US"/>
         </w:rPr>
-        <w:t xml:space="preserve">. This is identical to the normal one for </w:t>
-      </w:r>
-      <w:proofErr w:type="spellStart"/>
-      <w:r>
-        <w:rPr>
-          <w:lang w:val="en-US"/>
-        </w:rPr>
-        <w:t>BigDeal</w:t>
-      </w:r>
-      <w:proofErr w:type="spellEnd"/>
-      <w:r>
-        <w:rPr>
-          <w:lang w:val="en-US"/>
-        </w:rPr>
-        <w:t xml:space="preserve"> with one exception: any string of # characters will be replaced by at least the same number of digits for the session. </w:t>
+        <w:t xml:space="preserve">. This is identical to the normal one for BigDeal with one exception: any string of # characters will be replaced by at least the same number of digits for the session. </w:t>
       </w:r>
       <w:r>
         <w:rPr>
@@ -1143,21 +959,7 @@
         <w:rPr>
           <w:lang w:val="en-US"/>
         </w:rPr>
-        <w:t xml:space="preserve"> suppose the prefix given is </w:t>
-      </w:r>
-      <w:proofErr w:type="spellStart"/>
-      <w:r>
-        <w:rPr>
-          <w:lang w:val="en-US"/>
-        </w:rPr>
-        <w:t>bbrr</w:t>
-      </w:r>
-      <w:proofErr w:type="spellEnd"/>
-      <w:r>
-        <w:rPr>
-          <w:lang w:val="en-US"/>
-        </w:rPr>
-        <w:t>## and we generate session 7, the file prefix will be bbrr07.</w:t>
+        <w:t xml:space="preserve"> suppose the prefix given is bbrr## and we generate session 7, the file prefix will be bbrr07.</w:t>
       </w:r>
       <w:r>
         <w:rPr>
@@ -1207,19 +1009,11 @@
           <w:lang w:val="en-US"/>
         </w:rPr>
       </w:pPr>
-      <w:proofErr w:type="gramStart"/>
-      <w:r>
-        <w:rPr>
-          <w:lang w:val="en-US"/>
-        </w:rPr>
-        <w:t>The description</w:t>
-      </w:r>
-      <w:proofErr w:type="gramEnd"/>
-      <w:r>
-        <w:rPr>
-          <w:lang w:val="en-US"/>
-        </w:rPr>
-        <w:t>. A string, non-interpreted, that will be displayed when making the hands. Same trick with the # characters. Example: “Bermuda Bowl Round Robin #/23”</w:t>
+      <w:r>
+        <w:rPr>
+          <w:lang w:val="en-US"/>
+        </w:rPr>
+        <w:t>The description. A string, non-interpreted, that will be displayed when making the hands. Same trick with the # characters. Example: “Bermuda Bowl Round Robin #/23”</w:t>
       </w:r>
       <w:r>
         <w:rPr>
@@ -1279,6 +1073,25 @@
     </w:p>
     <w:p>
       <w:pPr>
+        <w:rPr>
+          <w:lang w:val="en-US"/>
+        </w:rPr>
+      </w:pPr>
+      <w:r>
+        <w:rPr>
+          <w:lang w:val="en-US"/>
+        </w:rPr>
+        <w:t xml:space="preserve">A new feature is giving </w:t>
+      </w:r>
+      <w:r>
+        <w:rPr>
+          <w:lang w:val="en-US"/>
+        </w:rPr>
+        <w:t>0 (zero) for number of sessions, to make them variable and unlimited.</w:t>
+      </w:r>
+    </w:p>
+    <w:p>
+      <w:pPr>
         <w:pStyle w:val="Heading1"/>
         <w:rPr>
           <w:lang w:val="en-US"/>
@@ -1341,7 +1154,6 @@
         </w:rPr>
         <w:t xml:space="preserve"> the tournament. He chooses the </w:t>
       </w:r>
-      <w:proofErr w:type="gramStart"/>
       <w:r>
         <w:rPr>
           <w:i/>
@@ -1350,14 +1162,12 @@
         </w:rPr>
         <w:t>publish</w:t>
       </w:r>
-      <w:proofErr w:type="gramEnd"/>
       <w:r>
         <w:rPr>
           <w:lang w:val="en-US"/>
         </w:rPr>
         <w:t xml:space="preserve"> </w:t>
       </w:r>
-      <w:proofErr w:type="gramStart"/>
       <w:r>
         <w:rPr>
           <w:lang w:val="en-US"/>
@@ -1368,14 +1178,7 @@
         <w:rPr>
           <w:lang w:val="en-US"/>
         </w:rPr>
-        <w:t>#</w:t>
-      </w:r>
-      <w:proofErr w:type="gramEnd"/>
-      <w:r>
-        <w:rPr>
-          <w:lang w:val="en-US"/>
-        </w:rPr>
-        <w:t xml:space="preserve">4) which terminates the first </w:t>
+        <w:t xml:space="preserve">#4) which terminates the first </w:t>
       </w:r>
       <w:r>
         <w:rPr>
@@ -1418,33 +1221,20 @@
         <w:rPr>
           <w:lang w:val="en-US"/>
         </w:rPr>
-        <w:t>, and stores it in the .</w:t>
-      </w:r>
-      <w:proofErr w:type="spellStart"/>
-      <w:r>
-        <w:rPr>
-          <w:lang w:val="en-US"/>
-        </w:rPr>
-        <w:t>sqk</w:t>
-      </w:r>
-      <w:proofErr w:type="spellEnd"/>
-      <w:r>
-        <w:rPr>
-          <w:lang w:val="en-US"/>
-        </w:rPr>
-        <w:t xml:space="preserve"> file. A cryptographic secure hash will appear in the description file as a signature to be used for checking later.</w:t>
-      </w:r>
-    </w:p>
-    <w:p>
-      <w:pPr>
-        <w:rPr>
-          <w:lang w:val="en-US"/>
-        </w:rPr>
-      </w:pPr>
-      <w:r>
-        <w:rPr>
-          <w:lang w:val="en-US"/>
-        </w:rPr>
+        <w:t>, and stores it in the .sqk file. A cryptographic secure hash will appear in the description file as a signature to be used for checking later.</w:t>
+      </w:r>
+    </w:p>
+    <w:p>
+      <w:pPr>
+        <w:rPr>
+          <w:lang w:val="en-US"/>
+        </w:rPr>
+      </w:pPr>
+      <w:r>
+        <w:rPr>
+          <w:lang w:val="en-US"/>
+        </w:rPr>
+        <w:lastRenderedPageBreak/>
         <w:t xml:space="preserve">Now </w:t>
       </w:r>
       <w:r>
@@ -1469,21 +1259,7 @@
         <w:rPr>
           <w:lang w:val="en-US"/>
         </w:rPr>
-        <w:t xml:space="preserve"> telling him to publish the .</w:t>
-      </w:r>
-      <w:proofErr w:type="spellStart"/>
-      <w:r>
-        <w:rPr>
-          <w:lang w:val="en-US"/>
-        </w:rPr>
-        <w:t>sqd</w:t>
-      </w:r>
-      <w:proofErr w:type="spellEnd"/>
-      <w:r>
-        <w:rPr>
-          <w:lang w:val="en-US"/>
-        </w:rPr>
-        <w:t xml:space="preserve"> file and keep </w:t>
+        <w:t xml:space="preserve"> telling him to publish the .sqd file and keep </w:t>
       </w:r>
       <w:r>
         <w:rPr>
@@ -1495,21 +1271,7 @@
         <w:rPr>
           <w:lang w:val="en-US"/>
         </w:rPr>
-        <w:t>.</w:t>
-      </w:r>
-      <w:proofErr w:type="spellStart"/>
-      <w:r>
-        <w:rPr>
-          <w:lang w:val="en-US"/>
-        </w:rPr>
-        <w:t>sqk</w:t>
-      </w:r>
-      <w:proofErr w:type="spellEnd"/>
-      <w:r>
-        <w:rPr>
-          <w:lang w:val="en-US"/>
-        </w:rPr>
-        <w:t xml:space="preserve"> file </w:t>
+        <w:t xml:space="preserve">.sqk file </w:t>
       </w:r>
       <w:r>
         <w:rPr>
@@ -1517,127 +1279,84 @@
           <w:iCs/>
           <w:lang w:val="en-US"/>
         </w:rPr>
-        <w:t xml:space="preserve">very </w:t>
-      </w:r>
-      <w:proofErr w:type="spellStart"/>
+        <w:t>very very</w:t>
+      </w:r>
+      <w:r>
+        <w:rPr>
+          <w:lang w:val="en-US"/>
+        </w:rPr>
+        <w:t xml:space="preserve"> secret.</w:t>
+      </w:r>
+    </w:p>
+    <w:p>
+      <w:pPr>
+        <w:rPr>
+          <w:lang w:val="en-US"/>
+        </w:rPr>
+      </w:pPr>
+      <w:r>
+        <w:rPr>
+          <w:lang w:val="en-US"/>
+        </w:rPr>
+        <w:t xml:space="preserve">Publishing the file can be done in various ways. </w:t>
+      </w:r>
+      <w:r>
+        <w:rPr>
+          <w:lang w:val="en-US"/>
+        </w:rPr>
+        <w:t>As an example</w:t>
+      </w:r>
+      <w:r>
+        <w:rPr>
+          <w:lang w:val="en-US"/>
+        </w:rPr>
+        <w:t xml:space="preserve"> putting it on the tournament website and/or </w:t>
+      </w:r>
+      <w:r>
+        <w:rPr>
+          <w:lang w:val="en-US"/>
+        </w:rPr>
+        <w:t>emailing</w:t>
+      </w:r>
+      <w:r>
+        <w:rPr>
+          <w:lang w:val="en-US"/>
+        </w:rPr>
+        <w:t xml:space="preserve"> it to all participants. We will see how this turns out.</w:t>
+      </w:r>
+      <w:r>
+        <w:rPr>
+          <w:lang w:val="en-US"/>
+        </w:rPr>
+        <w:t xml:space="preserve"> (The Polish Bridge Federation uses github to store</w:t>
+      </w:r>
+      <w:r>
+        <w:rPr>
+          <w:lang w:val="en-US"/>
+        </w:rPr>
+        <w:t xml:space="preserve"> it)</w:t>
+      </w:r>
+    </w:p>
+    <w:p>
+      <w:pPr>
+        <w:rPr>
+          <w:lang w:val="en-US"/>
+        </w:rPr>
+      </w:pPr>
+      <w:r>
+        <w:rPr>
+          <w:lang w:val="en-US"/>
+        </w:rPr>
+        <w:t xml:space="preserve">Keeping the key file </w:t>
+      </w:r>
       <w:r>
         <w:rPr>
           <w:i/>
           <w:iCs/>
           <w:lang w:val="en-US"/>
         </w:rPr>
-        <w:t>very</w:t>
-      </w:r>
-      <w:proofErr w:type="spellEnd"/>
-      <w:r>
-        <w:rPr>
-          <w:lang w:val="en-US"/>
-        </w:rPr>
-        <w:t xml:space="preserve"> secret.</w:t>
-      </w:r>
-    </w:p>
-    <w:p>
-      <w:pPr>
-        <w:rPr>
-          <w:lang w:val="en-US"/>
-        </w:rPr>
-      </w:pPr>
-      <w:r>
-        <w:rPr>
-          <w:lang w:val="en-US"/>
-        </w:rPr>
-        <w:lastRenderedPageBreak/>
-        <w:t xml:space="preserve">Publishing the file can be done in various ways. </w:t>
-      </w:r>
-      <w:r>
-        <w:rPr>
-          <w:lang w:val="en-US"/>
-        </w:rPr>
-        <w:t xml:space="preserve">As an </w:t>
-      </w:r>
-      <w:proofErr w:type="gramStart"/>
-      <w:r>
-        <w:rPr>
-          <w:lang w:val="en-US"/>
-        </w:rPr>
-        <w:t>example</w:t>
-      </w:r>
-      <w:proofErr w:type="gramEnd"/>
-      <w:r>
-        <w:rPr>
-          <w:lang w:val="en-US"/>
-        </w:rPr>
-        <w:t xml:space="preserve"> putting it on the tournament website and/or </w:t>
-      </w:r>
-      <w:r>
-        <w:rPr>
-          <w:lang w:val="en-US"/>
-        </w:rPr>
-        <w:t>emailing</w:t>
-      </w:r>
-      <w:r>
-        <w:rPr>
-          <w:lang w:val="en-US"/>
-        </w:rPr>
-        <w:t xml:space="preserve"> it to all participants. We will see how this turns out.</w:t>
-      </w:r>
-      <w:r>
-        <w:rPr>
-          <w:lang w:val="en-US"/>
-        </w:rPr>
-        <w:t xml:space="preserve"> (The Polish Bridge Federation uses </w:t>
-      </w:r>
-      <w:proofErr w:type="spellStart"/>
-      <w:r>
-        <w:rPr>
-          <w:lang w:val="en-US"/>
-        </w:rPr>
-        <w:t>github</w:t>
-      </w:r>
-      <w:proofErr w:type="spellEnd"/>
-      <w:r>
-        <w:rPr>
-          <w:lang w:val="en-US"/>
-        </w:rPr>
-        <w:t xml:space="preserve"> to store</w:t>
-      </w:r>
-      <w:r>
-        <w:rPr>
-          <w:lang w:val="en-US"/>
-        </w:rPr>
-        <w:t xml:space="preserve"> it)</w:t>
-      </w:r>
-    </w:p>
-    <w:p>
-      <w:pPr>
-        <w:rPr>
-          <w:lang w:val="en-US"/>
-        </w:rPr>
-      </w:pPr>
-      <w:r>
-        <w:rPr>
-          <w:lang w:val="en-US"/>
-        </w:rPr>
-        <w:t xml:space="preserve">Keeping the key file </w:t>
-      </w:r>
-      <w:r>
-        <w:rPr>
-          <w:i/>
-          <w:iCs/>
-          <w:lang w:val="en-US"/>
-        </w:rPr>
-        <w:t xml:space="preserve">very </w:t>
-      </w:r>
-      <w:proofErr w:type="spellStart"/>
-      <w:r>
-        <w:rPr>
-          <w:i/>
-          <w:iCs/>
-          <w:lang w:val="en-US"/>
-        </w:rPr>
-        <w:t>very</w:t>
-      </w:r>
-      <w:proofErr w:type="spellEnd"/>
+        <w:t>very very</w:t>
+      </w:r>
       <w:r>
         <w:rPr>
           <w:lang w:val="en-US"/>
@@ -1654,48 +1373,20 @@
         <w:rPr>
           <w:lang w:val="en-US"/>
         </w:rPr>
-        <w:t xml:space="preserve"> before the end of the tournament players will be able to generate </w:t>
-      </w:r>
-      <w:proofErr w:type="gramStart"/>
-      <w:r>
-        <w:rPr>
-          <w:lang w:val="en-US"/>
-        </w:rPr>
-        <w:t>the</w:t>
-      </w:r>
-      <w:proofErr w:type="gramEnd"/>
-      <w:r>
-        <w:rPr>
-          <w:lang w:val="en-US"/>
-        </w:rPr>
-        <w:t xml:space="preserve"> hands themselves before the session.</w:t>
-      </w:r>
-    </w:p>
-    <w:p>
-      <w:pPr>
-        <w:rPr>
-          <w:lang w:val="en-US"/>
-        </w:rPr>
-      </w:pPr>
-      <w:r>
-        <w:rPr>
-          <w:lang w:val="en-US"/>
-        </w:rPr>
-        <w:t>At this point interested players can do something. They can make a copy of the .</w:t>
-      </w:r>
-      <w:proofErr w:type="spellStart"/>
-      <w:r>
-        <w:rPr>
-          <w:lang w:val="en-US"/>
-        </w:rPr>
-        <w:t>sqd</w:t>
-      </w:r>
-      <w:proofErr w:type="spellEnd"/>
-      <w:r>
-        <w:rPr>
-          <w:lang w:val="en-US"/>
-        </w:rPr>
-        <w:t xml:space="preserve"> file as published. There is not a lot they can do with the file now, but the file contains a signature of all session keys</w:t>
+        <w:t xml:space="preserve"> before the end of the tournament players will be able to generate the hands themselves before the session.</w:t>
+      </w:r>
+    </w:p>
+    <w:p>
+      <w:pPr>
+        <w:rPr>
+          <w:lang w:val="en-US"/>
+        </w:rPr>
+      </w:pPr>
+      <w:r>
+        <w:rPr>
+          <w:lang w:val="en-US"/>
+        </w:rPr>
+        <w:t>At this point interested players can do something. They can make a copy of the .sqd file as published. There is not a lot they can do with the file now, but the file contains a signature of all session keys</w:t>
       </w:r>
       <w:r>
         <w:rPr>
@@ -1725,21 +1416,7 @@
         <w:rPr>
           <w:lang w:val="en-US"/>
         </w:rPr>
-        <w:t xml:space="preserve"> could change the keys and repost the .</w:t>
-      </w:r>
-      <w:proofErr w:type="spellStart"/>
-      <w:r>
-        <w:rPr>
-          <w:lang w:val="en-US"/>
-        </w:rPr>
-        <w:t>sqd</w:t>
-      </w:r>
-      <w:proofErr w:type="spellEnd"/>
-      <w:r>
-        <w:rPr>
-          <w:lang w:val="en-US"/>
-        </w:rPr>
-        <w:t xml:space="preserve"> file with a new signature.</w:t>
+        <w:t xml:space="preserve"> could change the keys and repost the .sqd file with a new signature.</w:t>
       </w:r>
     </w:p>
     <w:p>
@@ -1781,21 +1458,7 @@
         <w:rPr>
           <w:lang w:val="en-US"/>
         </w:rPr>
-        <w:t xml:space="preserve">This is the point where </w:t>
-      </w:r>
-      <w:proofErr w:type="gramStart"/>
-      <w:r>
-        <w:rPr>
-          <w:lang w:val="en-US"/>
-        </w:rPr>
-        <w:t>the Delayed</w:t>
-      </w:r>
-      <w:proofErr w:type="gramEnd"/>
-      <w:r>
-        <w:rPr>
-          <w:lang w:val="en-US"/>
-        </w:rPr>
-        <w:t xml:space="preserve"> Information comes to li</w:t>
+        <w:t>This is the point where the Delayed Information comes to li</w:t>
       </w:r>
       <w:r>
         <w:rPr>
@@ -2037,21 +1700,7 @@
         <w:rPr>
           <w:lang w:val="en-US"/>
         </w:rPr>
-        <w:t xml:space="preserve">Anyhow, </w:t>
-      </w:r>
-      <w:proofErr w:type="gramStart"/>
-      <w:r>
-        <w:rPr>
-          <w:lang w:val="en-US"/>
-        </w:rPr>
-        <w:t>at time</w:t>
-      </w:r>
-      <w:proofErr w:type="gramEnd"/>
-      <w:r>
-        <w:rPr>
-          <w:lang w:val="en-US"/>
-        </w:rPr>
-        <w:t xml:space="preserve"> T2 the </w:t>
+        <w:t xml:space="preserve">Anyhow, at time T2 the </w:t>
       </w:r>
       <w:r>
         <w:rPr>
@@ -2190,137 +1839,713 @@
         </w:rPr>
         <w:t xml:space="preserve"> needs to generate hands. Call the program and use the </w:t>
       </w:r>
-      <w:proofErr w:type="gramStart"/>
       <w:r>
         <w:rPr>
           <w:i/>
           <w:iCs/>
           <w:lang w:val="en-US"/>
         </w:rPr>
-        <w:t>generate hands</w:t>
-      </w:r>
-      <w:proofErr w:type="gramEnd"/>
+        <w:t xml:space="preserve">generate hands </w:t>
+      </w:r>
+      <w:r>
+        <w:rPr>
+          <w:lang w:val="en-US"/>
+        </w:rPr>
+        <w:t xml:space="preserve">option. You can specify a phase, and within the phase one or more sessions. </w:t>
+      </w:r>
+      <w:r>
+        <w:rPr>
+          <w:lang w:val="en-US"/>
+        </w:rPr>
+        <w:t>Phase numbers can</w:t>
+      </w:r>
+      <w:r>
+        <w:rPr>
+          <w:lang w:val="en-US"/>
+        </w:rPr>
+        <w:t xml:space="preserve"> be a single number or * meaning all sessions of all phases.</w:t>
+      </w:r>
+      <w:r>
+        <w:rPr>
+          <w:lang w:val="en-US"/>
+        </w:rPr>
+        <w:t xml:space="preserve"> </w:t>
+      </w:r>
+      <w:r>
+        <w:rPr>
+          <w:lang w:val="en-US"/>
+        </w:rPr>
+        <w:t xml:space="preserve">Session numbers can be a single </w:t>
+      </w:r>
+      <w:r>
+        <w:rPr>
+          <w:lang w:val="en-US"/>
+        </w:rPr>
+        <w:t>number (</w:t>
+      </w:r>
+      <w:r>
+        <w:rPr>
+          <w:lang w:val="en-US"/>
+        </w:rPr>
+        <w:t>make one session), a list like 1-10(make the first 10 sessions), or a * meaning all sessions</w:t>
+      </w:r>
+      <w:r>
+        <w:rPr>
+          <w:lang w:val="en-US"/>
+        </w:rPr>
+        <w:t xml:space="preserve">(not for unlimited </w:t>
+      </w:r>
+      <w:r>
+        <w:rPr>
+          <w:lang w:val="en-US"/>
+        </w:rPr>
+        <w:t>phases</w:t>
+      </w:r>
+      <w:r>
+        <w:rPr>
+          <w:lang w:val="en-US"/>
+        </w:rPr>
+        <w:t>)</w:t>
+      </w:r>
+      <w:r>
+        <w:rPr>
+          <w:lang w:val="en-US"/>
+        </w:rPr>
+        <w:t>.</w:t>
+      </w:r>
+      <w:r>
+        <w:rPr>
+          <w:lang w:val="en-US"/>
+        </w:rPr>
+        <w:t xml:space="preserve"> If you used the ? </w:t>
+      </w:r>
+      <w:r>
+        <w:rPr>
+          <w:lang w:val="en-US"/>
+        </w:rPr>
+        <w:lastRenderedPageBreak/>
+        <w:t xml:space="preserve">possibility for number of boards you will be prompted here for the number. That can be </w:t>
+      </w:r>
+      <w:r>
+        <w:rPr>
+          <w:lang w:val="en-US"/>
+        </w:rPr>
+        <w:t xml:space="preserve">just something like “16”, but more complex things like “1-7,8-14,15-21” </w:t>
+      </w:r>
+      <w:r>
+        <w:rPr>
+          <w:lang w:val="en-US"/>
+        </w:rPr>
+        <w:t>or</w:t>
+      </w:r>
+      <w:r>
+        <w:rPr>
+          <w:lang w:val="en-US"/>
+        </w:rPr>
+        <w:t xml:space="preserve"> “3x7” </w:t>
+      </w:r>
+      <w:r>
+        <w:rPr>
+          <w:lang w:val="en-US"/>
+        </w:rPr>
+        <w:t>are also allowed here.</w:t>
+      </w:r>
+    </w:p>
+    <w:p>
+      <w:pPr>
+        <w:rPr>
+          <w:lang w:val="en-US"/>
+        </w:rPr>
+      </w:pPr>
+      <w:r>
+        <w:rPr>
+          <w:lang w:val="en-US"/>
+        </w:rPr>
+        <w:t xml:space="preserve">The </w:t>
+      </w:r>
+      <w:r>
+        <w:rPr>
+          <w:lang w:val="en-US"/>
+        </w:rPr>
+        <w:t>ORG</w:t>
+      </w:r>
+      <w:r>
+        <w:rPr>
+          <w:lang w:val="en-US"/>
+        </w:rPr>
+        <w:t xml:space="preserve"> has no choice now, the hands will follow straight from two(three) pieces of information, the session key, the </w:t>
+      </w:r>
+      <w:r>
+        <w:rPr>
+          <w:lang w:val="en-US"/>
+        </w:rPr>
+        <w:t>D</w:t>
+      </w:r>
+      <w:r>
+        <w:rPr>
+          <w:lang w:val="en-US"/>
+        </w:rPr>
+        <w:t>V</w:t>
+      </w:r>
+      <w:r>
+        <w:rPr>
+          <w:lang w:val="en-US"/>
+        </w:rPr>
+        <w:t xml:space="preserve"> (</w:t>
+      </w:r>
+      <w:r>
+        <w:rPr>
+          <w:lang w:val="en-US"/>
+        </w:rPr>
+        <w:t xml:space="preserve">and a </w:t>
+      </w:r>
+      <w:r>
+        <w:rPr>
+          <w:lang w:val="en-US"/>
+        </w:rPr>
+        <w:t xml:space="preserve">possible </w:t>
+      </w:r>
+      <w:r>
+        <w:rPr>
+          <w:lang w:val="en-US"/>
+        </w:rPr>
+        <w:t xml:space="preserve">reserve set </w:t>
+      </w:r>
+      <w:r>
+        <w:rPr>
+          <w:lang w:val="en-US"/>
+        </w:rPr>
+        <w:t>option</w:t>
+      </w:r>
+      <w:r>
+        <w:rPr>
+          <w:lang w:val="en-US"/>
+        </w:rPr>
+        <w:t xml:space="preserve">). This normally finishes what you can do. There is however one emergency option: if as </w:t>
+      </w:r>
+      <w:r>
+        <w:rPr>
+          <w:lang w:val="en-US"/>
+        </w:rPr>
+        <w:t>an</w:t>
+      </w:r>
+      <w:r>
+        <w:rPr>
+          <w:lang w:val="en-US"/>
+        </w:rPr>
+        <w:t xml:space="preserve"> </w:t>
+      </w:r>
+      <w:r>
+        <w:rPr>
+          <w:lang w:val="en-US"/>
+        </w:rPr>
+        <w:t>ORG</w:t>
+      </w:r>
+      <w:r>
+        <w:rPr>
+          <w:lang w:val="en-US"/>
+        </w:rPr>
+        <w:t xml:space="preserve"> you screw up, or someone from your staff does</w:t>
+      </w:r>
+      <w:r>
+        <w:rPr>
+          <w:lang w:val="en-US"/>
+        </w:rPr>
+        <w:t>,</w:t>
+      </w:r>
+      <w:r>
+        <w:rPr>
+          <w:lang w:val="en-US"/>
+        </w:rPr>
+        <w:t xml:space="preserve"> it could be that in hopefully rare circumstances the hands for a session leak </w:t>
+      </w:r>
+      <w:r>
+        <w:rPr>
+          <w:lang w:val="en-US"/>
+        </w:rPr>
+        <w:t>out (</w:t>
+      </w:r>
+      <w:r>
+        <w:rPr>
+          <w:lang w:val="en-US"/>
+        </w:rPr>
+        <w:t xml:space="preserve">it has happened </w:t>
+      </w:r>
+      <w:r>
+        <w:rPr>
+          <w:lang w:val="en-US"/>
+        </w:rPr>
+        <w:t xml:space="preserve">for example </w:t>
+      </w:r>
+      <w:r>
+        <w:rPr>
+          <w:lang w:val="en-US"/>
+        </w:rPr>
+        <w:t xml:space="preserve">that hand records from session 4 were </w:t>
+      </w:r>
+      <w:r>
+        <w:rPr>
+          <w:lang w:val="en-US"/>
+        </w:rPr>
+        <w:t>distributed</w:t>
+      </w:r>
+      <w:r>
+        <w:rPr>
+          <w:lang w:val="en-US"/>
+        </w:rPr>
+        <w:t xml:space="preserve"> after session 3</w:t>
+      </w:r>
+      <w:r>
+        <w:rPr>
+          <w:lang w:val="en-US"/>
+        </w:rPr>
+        <w:t xml:space="preserve">). </w:t>
+      </w:r>
+      <w:r>
+        <w:rPr>
+          <w:lang w:val="en-US"/>
+        </w:rPr>
+        <w:t>So,</w:t>
+      </w:r>
+      <w:r>
+        <w:rPr>
+          <w:lang w:val="en-US"/>
+        </w:rPr>
+        <w:t xml:space="preserve"> there </w:t>
+      </w:r>
+      <w:r>
+        <w:rPr>
+          <w:lang w:val="en-US"/>
+        </w:rPr>
+        <w:t>must</w:t>
+      </w:r>
+      <w:r>
+        <w:rPr>
+          <w:lang w:val="en-US"/>
+        </w:rPr>
+        <w:t xml:space="preserve"> be a way to make reserve hands. This option </w:t>
+      </w:r>
+      <w:r>
+        <w:rPr>
+          <w:lang w:val="en-US"/>
+        </w:rPr>
+        <w:t>exists;</w:t>
+      </w:r>
+      <w:r>
+        <w:rPr>
+          <w:lang w:val="en-US"/>
+        </w:rPr>
+        <w:t xml:space="preserve"> you can make a reserve set for each session.</w:t>
+      </w:r>
+    </w:p>
+    <w:p>
+      <w:pPr>
+        <w:rPr>
+          <w:lang w:val="en-US"/>
+        </w:rPr>
+      </w:pPr>
+      <w:r>
+        <w:rPr>
+          <w:lang w:val="en-US"/>
+        </w:rPr>
+        <w:t>However,</w:t>
+      </w:r>
+      <w:r>
+        <w:rPr>
+          <w:lang w:val="en-US"/>
+        </w:rPr>
+        <w:t xml:space="preserve"> h</w:t>
+      </w:r>
+      <w:r>
+        <w:rPr>
+          <w:lang w:val="en-US"/>
+        </w:rPr>
+        <w:t xml:space="preserve">aving made reserve </w:t>
+      </w:r>
+      <w:r>
+        <w:rPr>
+          <w:lang w:val="en-US"/>
+        </w:rPr>
+        <w:t>sets,</w:t>
+      </w:r>
+      <w:r>
+        <w:rPr>
+          <w:lang w:val="en-US"/>
+        </w:rPr>
+        <w:t xml:space="preserve"> the </w:t>
+      </w:r>
+      <w:r>
+        <w:rPr>
+          <w:lang w:val="en-US"/>
+        </w:rPr>
+        <w:t>ORG</w:t>
+      </w:r>
+      <w:r>
+        <w:rPr>
+          <w:lang w:val="en-US"/>
+        </w:rPr>
+        <w:t xml:space="preserve"> is obliged to tell the players this. This can be done now and/or at time T4. A</w:t>
+      </w:r>
+      <w:r>
+        <w:rPr>
+          <w:lang w:val="en-US"/>
+        </w:rPr>
+        <w:t>n</w:t>
+      </w:r>
+      <w:r>
+        <w:rPr>
+          <w:lang w:val="en-US"/>
+        </w:rPr>
+        <w:t xml:space="preserve"> </w:t>
+      </w:r>
+      <w:r>
+        <w:rPr>
+          <w:lang w:val="en-US"/>
+        </w:rPr>
+        <w:t xml:space="preserve">honest </w:t>
+      </w:r>
+      <w:r>
+        <w:rPr>
+          <w:lang w:val="en-US"/>
+        </w:rPr>
+        <w:t>ORG</w:t>
+      </w:r>
+      <w:r>
+        <w:rPr>
+          <w:lang w:val="en-US"/>
+        </w:rPr>
+        <w:t xml:space="preserve"> that needs to do this more than once per </w:t>
+      </w:r>
+      <w:r>
+        <w:rPr>
+          <w:lang w:val="en-US"/>
+        </w:rPr>
+        <w:t>five</w:t>
+      </w:r>
+      <w:r>
+        <w:rPr>
+          <w:lang w:val="en-US"/>
+        </w:rPr>
+        <w:t xml:space="preserve"> tournaments is very sloppy.</w:t>
+      </w:r>
+    </w:p>
+    <w:p>
+      <w:pPr>
+        <w:rPr>
+          <w:lang w:val="en-US"/>
+        </w:rPr>
+      </w:pPr>
+      <w:r>
+        <w:rPr>
+          <w:lang w:val="en-US"/>
+        </w:rPr>
+        <w:t>A reserve set is made using the session key, the D</w:t>
+      </w:r>
+      <w:r>
+        <w:rPr>
+          <w:lang w:val="en-US"/>
+        </w:rPr>
+        <w:t>V</w:t>
+      </w:r>
+      <w:r>
+        <w:rPr>
+          <w:lang w:val="en-US"/>
+        </w:rPr>
+        <w:t xml:space="preserve"> and the </w:t>
+      </w:r>
+      <w:r>
+        <w:rPr>
+          <w:lang w:val="en-US"/>
+        </w:rPr>
+        <w:t>word reserve, the planned sets use the word original</w:t>
+      </w:r>
+      <w:r>
+        <w:rPr>
+          <w:lang w:val="en-US"/>
+        </w:rPr>
+        <w:t>.</w:t>
+      </w:r>
+      <w:r>
+        <w:rPr>
+          <w:lang w:val="en-US"/>
+        </w:rPr>
+        <w:t xml:space="preserve"> All of this is hidden from the ORG.</w:t>
+      </w:r>
+    </w:p>
+    <w:p>
+      <w:pPr>
+        <w:rPr>
+          <w:vertAlign w:val="subscript"/>
+          <w:lang w:val="en-US"/>
+        </w:rPr>
+      </w:pPr>
+      <w:r>
+        <w:rPr>
+          <w:lang w:val="en-US"/>
+        </w:rPr>
+        <w:t>The keys sent to BigDeal are very large</w:t>
+      </w:r>
+      <w:r>
+        <w:rPr>
+          <w:lang w:val="en-US"/>
+        </w:rPr>
+        <w:t xml:space="preserve">, </w:t>
+      </w:r>
+      <w:r>
+        <w:rPr>
+          <w:lang w:val="en-US"/>
+        </w:rPr>
+        <w:t>larger</w:t>
+      </w:r>
+      <w:r>
+        <w:rPr>
+          <w:lang w:val="en-US"/>
+        </w:rPr>
+        <w:t xml:space="preserve"> than the current possibilities of BigDeal, </w:t>
+      </w:r>
+      <w:r>
+        <w:rPr>
+          <w:lang w:val="en-US"/>
+        </w:rPr>
+        <w:t>which currently</w:t>
+      </w:r>
+      <w:r>
+        <w:rPr>
+          <w:lang w:val="en-US"/>
+        </w:rPr>
+        <w:t xml:space="preserve"> </w:t>
+      </w:r>
       <w:r>
         <w:rPr>
           <w:i/>
           <w:iCs/>
           <w:lang w:val="en-US"/>
         </w:rPr>
+        <w:t>only</w:t>
+      </w:r>
+      <w:r>
+        <w:rPr>
+          <w:lang w:val="en-US"/>
+        </w:rPr>
+        <w:t xml:space="preserve"> has 320 bits available </w:t>
+      </w:r>
+      <w:r>
+        <w:rPr>
+          <w:lang w:val="en-US"/>
+        </w:rPr>
+        <w:t xml:space="preserve">for the session key, which means it can generate </w:t>
+      </w:r>
+      <w:r>
+        <w:rPr>
+          <w:lang w:val="en-US"/>
+        </w:rPr>
+        <w:t>2</w:t>
+      </w:r>
+      <w:r>
+        <w:rPr>
+          <w:vertAlign w:val="superscript"/>
+          <w:lang w:val="en-US"/>
+        </w:rPr>
+        <w:t>320</w:t>
+      </w:r>
+      <w:r>
+        <w:rPr>
+          <w:vertAlign w:val="subscript"/>
+          <w:lang w:val="en-US"/>
+        </w:rPr>
         <w:t xml:space="preserve"> </w:t>
       </w:r>
       <w:r>
         <w:rPr>
           <w:lang w:val="en-US"/>
         </w:rPr>
-        <w:t xml:space="preserve">option. You can specify a phase, and within the phase one or more sessions. </w:t>
-      </w:r>
-      <w:r>
-        <w:rPr>
-          <w:lang w:val="en-US"/>
-        </w:rPr>
-        <w:t>Phase numbers can</w:t>
-      </w:r>
-      <w:r>
-        <w:rPr>
-          <w:lang w:val="en-US"/>
-        </w:rPr>
-        <w:t xml:space="preserve"> be a single number or * meaning all sessions of all phases.</w:t>
-      </w:r>
-      <w:r>
-        <w:rPr>
-          <w:lang w:val="en-US"/>
-        </w:rPr>
-        <w:t xml:space="preserve"> </w:t>
-      </w:r>
-      <w:r>
-        <w:rPr>
-          <w:lang w:val="en-US"/>
-        </w:rPr>
-        <w:t xml:space="preserve">Session numbers can be a single </w:t>
-      </w:r>
-      <w:r>
-        <w:rPr>
-          <w:lang w:val="en-US"/>
-        </w:rPr>
-        <w:t>number (</w:t>
-      </w:r>
-      <w:r>
-        <w:rPr>
-          <w:lang w:val="en-US"/>
-        </w:rPr>
-        <w:t>make one session), a list like 1-10(make the first 10 sessions), or a * meaning all sessions.</w:t>
-      </w:r>
-      <w:r>
-        <w:rPr>
-          <w:lang w:val="en-US"/>
-        </w:rPr>
-        <w:t xml:space="preserve"> If you used </w:t>
-      </w:r>
-      <w:proofErr w:type="gramStart"/>
-      <w:r>
-        <w:rPr>
-          <w:lang w:val="en-US"/>
-        </w:rPr>
-        <w:t>the ?</w:t>
-      </w:r>
-      <w:proofErr w:type="gramEnd"/>
-      <w:r>
-        <w:rPr>
-          <w:lang w:val="en-US"/>
-        </w:rPr>
-        <w:t xml:space="preserve"> possibility for number of </w:t>
-      </w:r>
-      <w:proofErr w:type="gramStart"/>
-      <w:r>
-        <w:rPr>
-          <w:lang w:val="en-US"/>
-        </w:rPr>
-        <w:t>boards</w:t>
-      </w:r>
-      <w:proofErr w:type="gramEnd"/>
-      <w:r>
-        <w:rPr>
-          <w:lang w:val="en-US"/>
-        </w:rPr>
-        <w:t xml:space="preserve"> you will be prompted here for the number. That can be </w:t>
-      </w:r>
-      <w:r>
-        <w:rPr>
-          <w:lang w:val="en-US"/>
-        </w:rPr>
-        <w:t xml:space="preserve">just something like “16”, but more complex things like “1-7,8-14,15-21” </w:t>
-      </w:r>
-      <w:r>
-        <w:rPr>
-          <w:lang w:val="en-US"/>
-        </w:rPr>
-        <w:t>or</w:t>
-      </w:r>
-      <w:r>
-        <w:rPr>
-          <w:lang w:val="en-US"/>
-        </w:rPr>
-        <w:t xml:space="preserve"> “3x7” </w:t>
-      </w:r>
-      <w:r>
-        <w:rPr>
-          <w:lang w:val="en-US"/>
-        </w:rPr>
-        <w:t>are also allowed here.</w:t>
-      </w:r>
-    </w:p>
-    <w:p>
-      <w:pPr>
-        <w:rPr>
-          <w:lang w:val="en-US"/>
-        </w:rPr>
-      </w:pPr>
-      <w:r>
-        <w:rPr>
-          <w:lang w:val="en-US"/>
-        </w:rPr>
-        <w:lastRenderedPageBreak/>
-        <w:t xml:space="preserve">The </w:t>
+        <w:t>sets of hands.</w:t>
+      </w:r>
+      <w:r>
+        <w:rPr>
+          <w:lang w:val="en-US"/>
+        </w:rPr>
+        <w:t xml:space="preserve"> This is about a million times a million times a million times the number of atoms in the known universe.</w:t>
+      </w:r>
+      <w:r>
+        <w:rPr>
+          <w:lang w:val="en-US"/>
+        </w:rPr>
+        <w:t xml:space="preserve"> It is enough.</w:t>
+      </w:r>
+    </w:p>
+    <w:p>
+      <w:pPr>
+        <w:rPr>
+          <w:lang w:val="en-US"/>
+        </w:rPr>
+      </w:pPr>
+      <w:r>
+        <w:rPr>
+          <w:lang w:val="en-US"/>
+        </w:rPr>
+        <w:t xml:space="preserve">When generating hands for the sessions there is an automatic option if the board numbers </w:t>
+      </w:r>
+      <w:r>
+        <w:rPr>
+          <w:lang w:val="en-US"/>
+        </w:rPr>
+        <w:t>differ per round</w:t>
+      </w:r>
+      <w:r>
+        <w:rPr>
+          <w:lang w:val="en-US"/>
+        </w:rPr>
+        <w:t>. For example, suppose a phase is 7 rounds with board numbers 1-10,11-20,21-30.</w:t>
+      </w:r>
+      <w:r>
+        <w:rPr>
+          <w:lang w:val="en-US"/>
+        </w:rPr>
+        <w:t xml:space="preserve"> Then each file of hands will contain 10 boards. For duplication purposes it could be handy </w:t>
+      </w:r>
+      <w:r>
+        <w:rPr>
+          <w:lang w:val="en-US"/>
+        </w:rPr>
+        <w:t xml:space="preserve">to have files containing board numbers 1-30. If </w:t>
+      </w:r>
+      <w:r>
+        <w:rPr>
+          <w:lang w:val="en-US"/>
+        </w:rPr>
+        <w:t>some</w:t>
+      </w:r>
+      <w:r>
+        <w:rPr>
+          <w:lang w:val="en-US"/>
+        </w:rPr>
+        <w:t xml:space="preserve"> sessi</w:t>
+      </w:r>
+      <w:r>
+        <w:rPr>
+          <w:lang w:val="en-US"/>
+        </w:rPr>
+        <w:t>o</w:t>
+      </w:r>
+      <w:r>
+        <w:rPr>
+          <w:lang w:val="en-US"/>
+        </w:rPr>
+        <w:t xml:space="preserve">ns of a phase are made </w:t>
+      </w:r>
+      <w:r>
+        <w:rPr>
+          <w:lang w:val="en-US"/>
+        </w:rPr>
+        <w:t>together (</w:t>
+      </w:r>
+      <w:r>
+        <w:rPr>
+          <w:lang w:val="en-US"/>
+        </w:rPr>
+        <w:t>for example with the * option)</w:t>
+      </w:r>
+      <w:r>
+        <w:rPr>
+          <w:lang w:val="en-US"/>
+        </w:rPr>
+        <w:t xml:space="preserve"> and if the formats you generate are </w:t>
+      </w:r>
+      <w:r>
+        <w:rPr>
+          <w:lang w:val="en-US"/>
+        </w:rPr>
+        <w:t>PBN (</w:t>
+      </w:r>
+      <w:r>
+        <w:rPr>
+          <w:lang w:val="en-US"/>
+        </w:rPr>
+        <w:t>or some untested ones)</w:t>
+      </w:r>
+      <w:r>
+        <w:rPr>
+          <w:lang w:val="en-US"/>
+        </w:rPr>
+        <w:t xml:space="preserve">, they will be combined automatically. </w:t>
+      </w:r>
+      <w:r>
+        <w:rPr>
+          <w:lang w:val="en-US"/>
+        </w:rPr>
+        <w:t>So,</w:t>
+      </w:r>
+      <w:r>
+        <w:rPr>
+          <w:lang w:val="en-US"/>
+        </w:rPr>
+        <w:t xml:space="preserve"> for example if session</w:t>
+      </w:r>
+      <w:r>
+        <w:rPr>
+          <w:lang w:val="en-US"/>
+        </w:rPr>
+        <w:t>s</w:t>
+      </w:r>
+      <w:r>
+        <w:rPr>
+          <w:lang w:val="en-US"/>
+        </w:rPr>
+        <w:t xml:space="preserve"> 1 to 3 are in files </w:t>
+      </w:r>
+      <w:r>
+        <w:rPr>
+          <w:lang w:val="en-US"/>
+        </w:rPr>
+        <w:t>RR01.pbn, RR02.pbn and RR03.pbn there will automatically appear a file called RR01-03</w:t>
+      </w:r>
+      <w:r>
+        <w:rPr>
+          <w:lang w:val="en-US"/>
+        </w:rPr>
+        <w:t>.pbn containing the first three sessions.</w:t>
+      </w:r>
+      <w:r>
+        <w:rPr>
+          <w:lang w:val="en-US"/>
+        </w:rPr>
+        <w:t xml:space="preserve"> The DUP format is too weird</w:t>
+      </w:r>
+      <w:r>
+        <w:rPr>
+          <w:lang w:val="en-US"/>
+        </w:rPr>
+        <w:t>; I strongly recommend not making or touching a DUP-file ever.</w:t>
+      </w:r>
+    </w:p>
+    <w:p>
+      <w:pPr>
+        <w:pStyle w:val="Heading1"/>
+        <w:rPr>
+          <w:lang w:val="en-US"/>
+        </w:rPr>
+      </w:pPr>
+      <w:bookmarkStart w:id="5" w:name="_Toc206093592"/>
+      <w:r>
+        <w:rPr>
+          <w:lang w:val="en-US"/>
+        </w:rPr>
+        <w:t>At time T4</w:t>
+      </w:r>
+      <w:bookmarkEnd w:id="5"/>
+    </w:p>
+    <w:p>
+      <w:pPr>
+        <w:rPr>
+          <w:lang w:val="en-US"/>
+        </w:rPr>
+      </w:pPr>
+      <w:r>
+        <w:rPr>
+          <w:lang w:val="en-US"/>
+        </w:rPr>
+        <w:t xml:space="preserve">The tournament is finished. The </w:t>
       </w:r>
       <w:r>
         <w:rPr>
@@ -2332,647 +2557,7 @@
         <w:rPr>
           <w:lang w:val="en-US"/>
         </w:rPr>
-        <w:t xml:space="preserve"> has no choice now, the hands will follow straight from two(three) pieces of information, the session key, the </w:t>
-      </w:r>
-      <w:r>
-        <w:rPr>
-          <w:lang w:val="en-US"/>
-        </w:rPr>
-        <w:t>D</w:t>
-      </w:r>
-      <w:r>
-        <w:rPr>
-          <w:lang w:val="en-US"/>
-        </w:rPr>
-        <w:t>V</w:t>
-      </w:r>
-      <w:r>
-        <w:rPr>
-          <w:lang w:val="en-US"/>
-        </w:rPr>
-        <w:t xml:space="preserve"> (</w:t>
-      </w:r>
-      <w:r>
-        <w:rPr>
-          <w:lang w:val="en-US"/>
-        </w:rPr>
-        <w:t xml:space="preserve">and a </w:t>
-      </w:r>
-      <w:r>
-        <w:rPr>
-          <w:lang w:val="en-US"/>
-        </w:rPr>
-        <w:t xml:space="preserve">possible </w:t>
-      </w:r>
-      <w:r>
-        <w:rPr>
-          <w:lang w:val="en-US"/>
-        </w:rPr>
-        <w:t xml:space="preserve">reserve set </w:t>
-      </w:r>
-      <w:r>
-        <w:rPr>
-          <w:lang w:val="en-US"/>
-        </w:rPr>
-        <w:t>option</w:t>
-      </w:r>
-      <w:r>
-        <w:rPr>
-          <w:lang w:val="en-US"/>
-        </w:rPr>
-        <w:t xml:space="preserve">). This normally finishes what you can do. There is however one emergency option: if as </w:t>
-      </w:r>
-      <w:r>
-        <w:rPr>
-          <w:lang w:val="en-US"/>
-        </w:rPr>
-        <w:t>an</w:t>
-      </w:r>
-      <w:r>
-        <w:rPr>
-          <w:lang w:val="en-US"/>
-        </w:rPr>
-        <w:t xml:space="preserve"> </w:t>
-      </w:r>
-      <w:r>
-        <w:rPr>
-          <w:lang w:val="en-US"/>
-        </w:rPr>
-        <w:t>ORG</w:t>
-      </w:r>
-      <w:r>
-        <w:rPr>
-          <w:lang w:val="en-US"/>
-        </w:rPr>
-        <w:t xml:space="preserve"> you screw up, or someone from your staff does</w:t>
-      </w:r>
-      <w:r>
-        <w:rPr>
-          <w:lang w:val="en-US"/>
-        </w:rPr>
-        <w:t>,</w:t>
-      </w:r>
-      <w:r>
-        <w:rPr>
-          <w:lang w:val="en-US"/>
-        </w:rPr>
-        <w:t xml:space="preserve"> it could be that in hopefully rare circumstances the hands for a session leak </w:t>
-      </w:r>
-      <w:r>
-        <w:rPr>
-          <w:lang w:val="en-US"/>
-        </w:rPr>
-        <w:t>out (</w:t>
-      </w:r>
-      <w:r>
-        <w:rPr>
-          <w:lang w:val="en-US"/>
-        </w:rPr>
-        <w:t xml:space="preserve">it has happened </w:t>
-      </w:r>
-      <w:r>
-        <w:rPr>
-          <w:lang w:val="en-US"/>
-        </w:rPr>
-        <w:t xml:space="preserve">for example </w:t>
-      </w:r>
-      <w:r>
-        <w:rPr>
-          <w:lang w:val="en-US"/>
-        </w:rPr>
-        <w:t xml:space="preserve">that hand records from session 4 were </w:t>
-      </w:r>
-      <w:r>
-        <w:rPr>
-          <w:lang w:val="en-US"/>
-        </w:rPr>
-        <w:t>distributed</w:t>
-      </w:r>
-      <w:r>
-        <w:rPr>
-          <w:lang w:val="en-US"/>
-        </w:rPr>
-        <w:t xml:space="preserve"> after session 3</w:t>
-      </w:r>
-      <w:r>
-        <w:rPr>
-          <w:lang w:val="en-US"/>
-        </w:rPr>
-        <w:t xml:space="preserve">). </w:t>
-      </w:r>
-      <w:r>
-        <w:rPr>
-          <w:lang w:val="en-US"/>
-        </w:rPr>
-        <w:t>So,</w:t>
-      </w:r>
-      <w:r>
-        <w:rPr>
-          <w:lang w:val="en-US"/>
-        </w:rPr>
-        <w:t xml:space="preserve"> there </w:t>
-      </w:r>
-      <w:r>
-        <w:rPr>
-          <w:lang w:val="en-US"/>
-        </w:rPr>
-        <w:t>must</w:t>
-      </w:r>
-      <w:r>
-        <w:rPr>
-          <w:lang w:val="en-US"/>
-        </w:rPr>
-        <w:t xml:space="preserve"> be a way to make reserve hands. This option </w:t>
-      </w:r>
-      <w:r>
-        <w:rPr>
-          <w:lang w:val="en-US"/>
-        </w:rPr>
-        <w:t>exists;</w:t>
-      </w:r>
-      <w:r>
-        <w:rPr>
-          <w:lang w:val="en-US"/>
-        </w:rPr>
-        <w:t xml:space="preserve"> you can make a reserve set for each session.</w:t>
-      </w:r>
-    </w:p>
-    <w:p>
-      <w:pPr>
-        <w:rPr>
-          <w:lang w:val="en-US"/>
-        </w:rPr>
-      </w:pPr>
-      <w:r>
-        <w:rPr>
-          <w:lang w:val="en-US"/>
-        </w:rPr>
-        <w:t>However,</w:t>
-      </w:r>
-      <w:r>
-        <w:rPr>
-          <w:lang w:val="en-US"/>
-        </w:rPr>
-        <w:t xml:space="preserve"> h</w:t>
-      </w:r>
-      <w:r>
-        <w:rPr>
-          <w:lang w:val="en-US"/>
-        </w:rPr>
-        <w:t xml:space="preserve">aving made reserve </w:t>
-      </w:r>
-      <w:r>
-        <w:rPr>
-          <w:lang w:val="en-US"/>
-        </w:rPr>
-        <w:t>sets,</w:t>
-      </w:r>
-      <w:r>
-        <w:rPr>
-          <w:lang w:val="en-US"/>
-        </w:rPr>
-        <w:t xml:space="preserve"> the </w:t>
-      </w:r>
-      <w:r>
-        <w:rPr>
-          <w:lang w:val="en-US"/>
-        </w:rPr>
-        <w:t>ORG</w:t>
-      </w:r>
-      <w:r>
-        <w:rPr>
-          <w:lang w:val="en-US"/>
-        </w:rPr>
-        <w:t xml:space="preserve"> is obliged to tell the players this. This can be done now and/or at time T4. A</w:t>
-      </w:r>
-      <w:r>
-        <w:rPr>
-          <w:lang w:val="en-US"/>
-        </w:rPr>
-        <w:t>n</w:t>
-      </w:r>
-      <w:r>
-        <w:rPr>
-          <w:lang w:val="en-US"/>
-        </w:rPr>
-        <w:t xml:space="preserve"> </w:t>
-      </w:r>
-      <w:r>
-        <w:rPr>
-          <w:lang w:val="en-US"/>
-        </w:rPr>
-        <w:t xml:space="preserve">honest </w:t>
-      </w:r>
-      <w:r>
-        <w:rPr>
-          <w:lang w:val="en-US"/>
-        </w:rPr>
-        <w:t>ORG</w:t>
-      </w:r>
-      <w:r>
-        <w:rPr>
-          <w:lang w:val="en-US"/>
-        </w:rPr>
-        <w:t xml:space="preserve"> that needs to do this more than once per </w:t>
-      </w:r>
-      <w:r>
-        <w:rPr>
-          <w:lang w:val="en-US"/>
-        </w:rPr>
-        <w:t>five</w:t>
-      </w:r>
-      <w:r>
-        <w:rPr>
-          <w:lang w:val="en-US"/>
-        </w:rPr>
-        <w:t xml:space="preserve"> tournaments is very sloppy.</w:t>
-      </w:r>
-    </w:p>
-    <w:p>
-      <w:pPr>
-        <w:rPr>
-          <w:lang w:val="en-US"/>
-        </w:rPr>
-      </w:pPr>
-      <w:r>
-        <w:rPr>
-          <w:lang w:val="en-US"/>
-        </w:rPr>
-        <w:t>A reserve set is made using the session key, the D</w:t>
-      </w:r>
-      <w:r>
-        <w:rPr>
-          <w:lang w:val="en-US"/>
-        </w:rPr>
-        <w:t>V</w:t>
-      </w:r>
-      <w:r>
-        <w:rPr>
-          <w:lang w:val="en-US"/>
-        </w:rPr>
-        <w:t xml:space="preserve"> and the </w:t>
-      </w:r>
-      <w:r>
-        <w:rPr>
-          <w:lang w:val="en-US"/>
-        </w:rPr>
-        <w:t>word reserve, the planned sets use the word original</w:t>
-      </w:r>
-      <w:r>
-        <w:rPr>
-          <w:lang w:val="en-US"/>
-        </w:rPr>
-        <w:t>.</w:t>
-      </w:r>
-      <w:r>
-        <w:rPr>
-          <w:lang w:val="en-US"/>
-        </w:rPr>
-        <w:t xml:space="preserve"> All of this is hidden from the ORG.</w:t>
-      </w:r>
-    </w:p>
-    <w:p>
-      <w:pPr>
-        <w:rPr>
-          <w:vertAlign w:val="subscript"/>
-          <w:lang w:val="en-US"/>
-        </w:rPr>
-      </w:pPr>
-      <w:r>
-        <w:rPr>
-          <w:lang w:val="en-US"/>
-        </w:rPr>
-        <w:t xml:space="preserve">The keys sent to </w:t>
-      </w:r>
-      <w:proofErr w:type="spellStart"/>
-      <w:r>
-        <w:rPr>
-          <w:lang w:val="en-US"/>
-        </w:rPr>
-        <w:t>BigDeal</w:t>
-      </w:r>
-      <w:proofErr w:type="spellEnd"/>
-      <w:r>
-        <w:rPr>
-          <w:lang w:val="en-US"/>
-        </w:rPr>
-        <w:t xml:space="preserve"> are very large</w:t>
-      </w:r>
-      <w:r>
-        <w:rPr>
-          <w:lang w:val="en-US"/>
-        </w:rPr>
-        <w:t xml:space="preserve">, </w:t>
-      </w:r>
-      <w:r>
-        <w:rPr>
-          <w:lang w:val="en-US"/>
-        </w:rPr>
-        <w:t>larger</w:t>
-      </w:r>
-      <w:r>
-        <w:rPr>
-          <w:lang w:val="en-US"/>
-        </w:rPr>
-        <w:t xml:space="preserve"> than the current possibilities of </w:t>
-      </w:r>
-      <w:proofErr w:type="spellStart"/>
-      <w:r>
-        <w:rPr>
-          <w:lang w:val="en-US"/>
-        </w:rPr>
-        <w:t>BigDeal</w:t>
-      </w:r>
-      <w:proofErr w:type="spellEnd"/>
-      <w:r>
-        <w:rPr>
-          <w:lang w:val="en-US"/>
-        </w:rPr>
-        <w:t xml:space="preserve">, </w:t>
-      </w:r>
-      <w:r>
-        <w:rPr>
-          <w:lang w:val="en-US"/>
-        </w:rPr>
-        <w:t>which currently</w:t>
-      </w:r>
-      <w:r>
-        <w:rPr>
-          <w:lang w:val="en-US"/>
-        </w:rPr>
-        <w:t xml:space="preserve"> </w:t>
-      </w:r>
-      <w:r>
-        <w:rPr>
-          <w:i/>
-          <w:iCs/>
-          <w:lang w:val="en-US"/>
-        </w:rPr>
-        <w:t>only</w:t>
-      </w:r>
-      <w:r>
-        <w:rPr>
-          <w:lang w:val="en-US"/>
-        </w:rPr>
-        <w:t xml:space="preserve"> has 320 bits available </w:t>
-      </w:r>
-      <w:r>
-        <w:rPr>
-          <w:lang w:val="en-US"/>
-        </w:rPr>
-        <w:t xml:space="preserve">for the session key, which means it can generate </w:t>
-      </w:r>
-      <w:r>
-        <w:rPr>
-          <w:lang w:val="en-US"/>
-        </w:rPr>
-        <w:t>2</w:t>
-      </w:r>
-      <w:r>
-        <w:rPr>
-          <w:vertAlign w:val="superscript"/>
-          <w:lang w:val="en-US"/>
-        </w:rPr>
-        <w:t>320</w:t>
-      </w:r>
-      <w:r>
-        <w:rPr>
-          <w:vertAlign w:val="subscript"/>
-          <w:lang w:val="en-US"/>
-        </w:rPr>
-        <w:t xml:space="preserve"> </w:t>
-      </w:r>
-      <w:r>
-        <w:rPr>
-          <w:lang w:val="en-US"/>
-        </w:rPr>
-        <w:t>sets of hands.</w:t>
-      </w:r>
-      <w:r>
-        <w:rPr>
-          <w:lang w:val="en-US"/>
-        </w:rPr>
-        <w:t xml:space="preserve"> This is about a million times a million times a million times the number of atoms in the known universe.</w:t>
-      </w:r>
-      <w:r>
-        <w:rPr>
-          <w:lang w:val="en-US"/>
-        </w:rPr>
-        <w:t xml:space="preserve"> It is enough.</w:t>
-      </w:r>
-    </w:p>
-    <w:p>
-      <w:pPr>
-        <w:rPr>
-          <w:lang w:val="en-US"/>
-        </w:rPr>
-      </w:pPr>
-      <w:r>
-        <w:rPr>
-          <w:lang w:val="en-US"/>
-        </w:rPr>
-        <w:t xml:space="preserve">When generating hands for the sessions there is an automatic option if the board numbers </w:t>
-      </w:r>
-      <w:r>
-        <w:rPr>
-          <w:lang w:val="en-US"/>
-        </w:rPr>
-        <w:t>differ per round</w:t>
-      </w:r>
-      <w:r>
-        <w:rPr>
-          <w:lang w:val="en-US"/>
-        </w:rPr>
-        <w:t>. For example, suppose a phase is 7 rounds with board numbers 1-10,11-20,21-30.</w:t>
-      </w:r>
-      <w:r>
-        <w:rPr>
-          <w:lang w:val="en-US"/>
-        </w:rPr>
-        <w:t xml:space="preserve"> Then each file of hands will contain 10 boards. For duplication purposes it could be handy </w:t>
-      </w:r>
-      <w:r>
-        <w:rPr>
-          <w:lang w:val="en-US"/>
-        </w:rPr>
-        <w:t xml:space="preserve">to have files containing board numbers 1-30. If </w:t>
-      </w:r>
-      <w:r>
-        <w:rPr>
-          <w:lang w:val="en-US"/>
-        </w:rPr>
-        <w:t>some</w:t>
-      </w:r>
-      <w:r>
-        <w:rPr>
-          <w:lang w:val="en-US"/>
-        </w:rPr>
-        <w:t xml:space="preserve"> sessi</w:t>
-      </w:r>
-      <w:r>
-        <w:rPr>
-          <w:lang w:val="en-US"/>
-        </w:rPr>
-        <w:t>o</w:t>
-      </w:r>
-      <w:r>
-        <w:rPr>
-          <w:lang w:val="en-US"/>
-        </w:rPr>
-        <w:t xml:space="preserve">ns of a phase are made </w:t>
-      </w:r>
-      <w:r>
-        <w:rPr>
-          <w:lang w:val="en-US"/>
-        </w:rPr>
-        <w:t>together (</w:t>
-      </w:r>
-      <w:r>
-        <w:rPr>
-          <w:lang w:val="en-US"/>
-        </w:rPr>
-        <w:t>for example with the * option)</w:t>
-      </w:r>
-      <w:r>
-        <w:rPr>
-          <w:lang w:val="en-US"/>
-        </w:rPr>
-        <w:t xml:space="preserve"> and if the formats you generate are </w:t>
-      </w:r>
-      <w:r>
-        <w:rPr>
-          <w:lang w:val="en-US"/>
-        </w:rPr>
-        <w:t>PBN (</w:t>
-      </w:r>
-      <w:r>
-        <w:rPr>
-          <w:lang w:val="en-US"/>
-        </w:rPr>
-        <w:t>or some untested ones)</w:t>
-      </w:r>
-      <w:r>
-        <w:rPr>
-          <w:lang w:val="en-US"/>
-        </w:rPr>
-        <w:t xml:space="preserve">, they will be combined automatically. </w:t>
-      </w:r>
-      <w:r>
-        <w:rPr>
-          <w:lang w:val="en-US"/>
-        </w:rPr>
-        <w:t>So,</w:t>
-      </w:r>
-      <w:r>
-        <w:rPr>
-          <w:lang w:val="en-US"/>
-        </w:rPr>
-        <w:t xml:space="preserve"> for example if session</w:t>
-      </w:r>
-      <w:r>
-        <w:rPr>
-          <w:lang w:val="en-US"/>
-        </w:rPr>
-        <w:t>s</w:t>
-      </w:r>
-      <w:r>
-        <w:rPr>
-          <w:lang w:val="en-US"/>
-        </w:rPr>
-        <w:t xml:space="preserve"> 1 to 3 are in files </w:t>
-      </w:r>
-      <w:r>
-        <w:rPr>
-          <w:lang w:val="en-US"/>
-        </w:rPr>
-        <w:t>RR01.pbn, RR02.pbn and RR03.pbn there will automatically appear a file called RR01-03</w:t>
-      </w:r>
-      <w:r>
-        <w:rPr>
-          <w:lang w:val="en-US"/>
-        </w:rPr>
-        <w:t>.pbn containing the first three sessions.</w:t>
-      </w:r>
-      <w:r>
-        <w:rPr>
-          <w:lang w:val="en-US"/>
-        </w:rPr>
-        <w:t xml:space="preserve"> The DUP format is too weird</w:t>
-      </w:r>
-      <w:r>
-        <w:rPr>
-          <w:lang w:val="en-US"/>
-        </w:rPr>
-        <w:t>; I strongly recommend not making or touching a DUP-file ever.</w:t>
-      </w:r>
-    </w:p>
-    <w:p>
-      <w:pPr>
-        <w:pStyle w:val="Heading1"/>
-        <w:rPr>
-          <w:lang w:val="en-US"/>
-        </w:rPr>
-      </w:pPr>
-      <w:bookmarkStart w:id="5" w:name="_Toc206093592"/>
-      <w:r>
-        <w:rPr>
-          <w:lang w:val="en-US"/>
-        </w:rPr>
-        <w:t>At time T4</w:t>
-      </w:r>
-      <w:bookmarkEnd w:id="5"/>
-    </w:p>
-    <w:p>
-      <w:pPr>
-        <w:rPr>
-          <w:lang w:val="en-US"/>
-        </w:rPr>
-      </w:pPr>
-      <w:r>
-        <w:rPr>
-          <w:lang w:val="en-US"/>
-        </w:rPr>
-        <w:t xml:space="preserve">The tournament is finished. The </w:t>
-      </w:r>
-      <w:r>
-        <w:rPr>
-          <w:lang w:val="en-US"/>
-        </w:rPr>
-        <w:t>ORG</w:t>
-      </w:r>
-      <w:r>
-        <w:rPr>
-          <w:lang w:val="en-US"/>
-        </w:rPr>
-        <w:t xml:space="preserve"> now publishes both the updated .</w:t>
-      </w:r>
-      <w:proofErr w:type="spellStart"/>
-      <w:r>
-        <w:rPr>
-          <w:lang w:val="en-US"/>
-        </w:rPr>
-        <w:t>sqd</w:t>
-      </w:r>
-      <w:proofErr w:type="spellEnd"/>
-      <w:r>
-        <w:rPr>
-          <w:lang w:val="en-US"/>
-        </w:rPr>
-        <w:t xml:space="preserve"> file and the .</w:t>
-      </w:r>
-      <w:proofErr w:type="spellStart"/>
-      <w:r>
-        <w:rPr>
-          <w:lang w:val="en-US"/>
-        </w:rPr>
-        <w:t>sqk</w:t>
-      </w:r>
-      <w:proofErr w:type="spellEnd"/>
-      <w:r>
-        <w:rPr>
-          <w:lang w:val="en-US"/>
-        </w:rPr>
-        <w:t xml:space="preserve"> file. </w:t>
+        <w:t xml:space="preserve"> now publishes both the updated .sqd file and the .sqk file. </w:t>
       </w:r>
       <w:r>
         <w:rPr>
@@ -3136,57 +2721,21 @@
         <w:rPr>
           <w:lang w:val="en-US"/>
         </w:rPr>
-        <w:t xml:space="preserve">Connection to </w:t>
-      </w:r>
-      <w:proofErr w:type="spellStart"/>
-      <w:r>
-        <w:rPr>
-          <w:lang w:val="en-US"/>
-        </w:rPr>
-        <w:t>BigDeal</w:t>
+        <w:t>Connection to BigDeal</w:t>
       </w:r>
       <w:bookmarkEnd w:id="6"/>
-      <w:proofErr w:type="spellEnd"/>
-    </w:p>
-    <w:p>
-      <w:pPr>
-        <w:rPr>
-          <w:lang w:val="en-US"/>
-        </w:rPr>
-      </w:pPr>
-      <w:r>
-        <w:rPr>
-          <w:lang w:val="en-US"/>
-        </w:rPr>
-        <w:t xml:space="preserve">This software uses the </w:t>
-      </w:r>
-      <w:proofErr w:type="spellStart"/>
-      <w:r>
-        <w:rPr>
-          <w:lang w:val="en-US"/>
-        </w:rPr>
-        <w:t>bigdealx</w:t>
-      </w:r>
-      <w:proofErr w:type="spellEnd"/>
-      <w:r>
-        <w:rPr>
-          <w:lang w:val="en-US"/>
-        </w:rPr>
-        <w:t xml:space="preserve"> version of </w:t>
-      </w:r>
-      <w:proofErr w:type="spellStart"/>
-      <w:r>
-        <w:rPr>
-          <w:lang w:val="en-US"/>
-        </w:rPr>
-        <w:t>BigDeal</w:t>
-      </w:r>
-      <w:proofErr w:type="spellEnd"/>
-      <w:r>
-        <w:rPr>
-          <w:lang w:val="en-US"/>
-        </w:rPr>
-        <w:t xml:space="preserve">. Normally the ReadMe </w:t>
+    </w:p>
+    <w:p>
+      <w:pPr>
+        <w:rPr>
+          <w:lang w:val="en-US"/>
+        </w:rPr>
+      </w:pPr>
+      <w:r>
+        <w:rPr>
+          <w:lang w:val="en-US"/>
+        </w:rPr>
+        <w:t xml:space="preserve">This software uses the bigdealx version of BigDeal. Normally the ReadMe </w:t>
       </w:r>
       <w:r>
         <w:rPr>
@@ -3223,6 +2772,7 @@
         <w:rPr>
           <w:lang w:val="en-US"/>
         </w:rPr>
+        <w:lastRenderedPageBreak/>
         <w:t xml:space="preserve">There are three </w:t>
       </w:r>
       <w:r>
@@ -3249,40 +2799,17 @@
           <w:lang w:val="en-US"/>
         </w:rPr>
       </w:pPr>
-      <w:proofErr w:type="spellStart"/>
-      <w:r>
-        <w:rPr>
-          <w:lang w:val="en-US"/>
-        </w:rPr>
-        <w:lastRenderedPageBreak/>
-        <w:t>BigDeal</w:t>
-      </w:r>
-      <w:proofErr w:type="spellEnd"/>
-      <w:r>
-        <w:rPr>
-          <w:lang w:val="en-US"/>
-        </w:rPr>
-        <w:t xml:space="preserve"> used </w:t>
-      </w:r>
-      <w:proofErr w:type="gramStart"/>
-      <w:r>
-        <w:rPr>
-          <w:lang w:val="en-US"/>
-        </w:rPr>
-        <w:t xml:space="preserve">a </w:t>
-      </w:r>
-      <w:r>
-        <w:rPr>
-          <w:lang w:val="en-US"/>
-        </w:rPr>
-        <w:t>160</w:t>
-      </w:r>
-      <w:proofErr w:type="gramEnd"/>
-      <w:r>
-        <w:rPr>
-          <w:lang w:val="en-US"/>
-        </w:rPr>
-        <w:t>-bit</w:t>
+      <w:r>
+        <w:rPr>
+          <w:lang w:val="en-US"/>
+        </w:rPr>
+        <w:t xml:space="preserve">BigDeal used a </w:t>
+      </w:r>
+      <w:r>
+        <w:rPr>
+          <w:lang w:val="en-US"/>
+        </w:rPr>
+        <w:t>160-bit</w:t>
       </w:r>
       <w:r>
         <w:rPr>
@@ -3354,21 +2881,7 @@
         <w:rPr>
           <w:lang w:val="en-US"/>
         </w:rPr>
-        <w:t xml:space="preserve">Normally using dangerous flags to </w:t>
-      </w:r>
-      <w:proofErr w:type="spellStart"/>
-      <w:r>
-        <w:rPr>
-          <w:lang w:val="en-US"/>
-        </w:rPr>
-        <w:t>BigDealx</w:t>
-      </w:r>
-      <w:proofErr w:type="spellEnd"/>
-      <w:r>
-        <w:rPr>
-          <w:lang w:val="en-US"/>
-        </w:rPr>
-        <w:t xml:space="preserve"> causes it to scream and convince you not </w:t>
+        <w:t xml:space="preserve">Normally using dangerous flags to BigDealx causes it to scream and convince you not </w:t>
       </w:r>
       <w:r>
         <w:rPr>
@@ -3398,21 +2911,7 @@
         <w:rPr>
           <w:lang w:val="en-US"/>
         </w:rPr>
-        <w:t xml:space="preserve">Normally </w:t>
-      </w:r>
-      <w:proofErr w:type="spellStart"/>
-      <w:r>
-        <w:rPr>
-          <w:lang w:val="en-US"/>
-        </w:rPr>
-        <w:t>BigDeal</w:t>
-      </w:r>
-      <w:proofErr w:type="spellEnd"/>
-      <w:r>
-        <w:rPr>
-          <w:lang w:val="en-US"/>
-        </w:rPr>
-        <w:t xml:space="preserve"> in the x version complains very loudly of regenerating sets of hands. With this software regenerating sets of hands </w:t>
+        <w:t xml:space="preserve">Normally BigDeal in the x version complains very loudly of regenerating sets of hands. With this software regenerating sets of hands </w:t>
       </w:r>
       <w:r>
         <w:rPr>
@@ -3564,35 +3063,7 @@
         <w:rPr>
           <w:lang w:val="en-US"/>
         </w:rPr>
-        <w:t xml:space="preserve">So, pointing you to the </w:t>
-      </w:r>
-      <w:proofErr w:type="spellStart"/>
-      <w:r>
-        <w:rPr>
-          <w:lang w:val="en-US"/>
-        </w:rPr>
-        <w:t>BigDeal</w:t>
-      </w:r>
-      <w:proofErr w:type="spellEnd"/>
-      <w:r>
-        <w:rPr>
-          <w:lang w:val="en-US"/>
-        </w:rPr>
-        <w:t xml:space="preserve"> online info, the hands in </w:t>
-      </w:r>
-      <w:proofErr w:type="spellStart"/>
-      <w:r>
-        <w:rPr>
-          <w:lang w:val="en-US"/>
-        </w:rPr>
-        <w:t>BigDealx</w:t>
-      </w:r>
-      <w:proofErr w:type="spellEnd"/>
-      <w:r>
-        <w:rPr>
-          <w:lang w:val="en-US"/>
-        </w:rPr>
-        <w:t xml:space="preserve"> with -W string are now generated by running the following three things through a RIPEMD-160 hash:</w:t>
+        <w:t>So, pointing you to the BigDeal online info, the hands in BigDealx with -W string are now generated by running the following three things through a RIPEMD-160 hash:</w:t>
       </w:r>
     </w:p>
     <w:p>
@@ -3683,21 +3154,7 @@
         <w:rPr>
           <w:lang w:val="en-US"/>
         </w:rPr>
-        <w:t xml:space="preserve">After that all other normal </w:t>
-      </w:r>
-      <w:proofErr w:type="spellStart"/>
-      <w:r>
-        <w:rPr>
-          <w:lang w:val="en-US"/>
-        </w:rPr>
-        <w:t>BigDeal</w:t>
-      </w:r>
-      <w:proofErr w:type="spellEnd"/>
-      <w:r>
-        <w:rPr>
-          <w:lang w:val="en-US"/>
-        </w:rPr>
-        <w:t xml:space="preserve"> things happen.</w:t>
+        <w:t>After that all other normal BigDeal things happen.</w:t>
       </w:r>
     </w:p>
     <w:p>
@@ -3728,23 +3185,7 @@
           <w:rFonts w:cstheme="minorHAnsi"/>
           <w:lang w:val="en-US"/>
         </w:rPr>
-        <w:t xml:space="preserve">The formats of </w:t>
-      </w:r>
-      <w:proofErr w:type="gramStart"/>
-      <w:r>
-        <w:rPr>
-          <w:rFonts w:cstheme="minorHAnsi"/>
-          <w:lang w:val="en-US"/>
-        </w:rPr>
-        <w:t>the .sq</w:t>
-      </w:r>
-      <w:proofErr w:type="gramEnd"/>
-      <w:r>
-        <w:rPr>
-          <w:rFonts w:cstheme="minorHAnsi"/>
-          <w:lang w:val="en-US"/>
-        </w:rPr>
-        <w:t>? files are:</w:t>
+        <w:t>The formats of the .sq? files are:</w:t>
       </w:r>
     </w:p>
     <w:p>
@@ -3756,7 +3197,6 @@
           <w:lang w:val="en-US"/>
         </w:rPr>
       </w:pPr>
-      <w:proofErr w:type="spellStart"/>
       <w:r>
         <w:rPr>
           <w:rFonts w:cstheme="minorHAnsi"/>
@@ -3766,7 +3206,6 @@
         </w:rPr>
         <w:t>Test.sqd</w:t>
       </w:r>
-      <w:proofErr w:type="spellEnd"/>
     </w:p>
     <w:p>
       <w:pPr>
@@ -3784,219 +3223,334 @@
           <w:szCs w:val="28"/>
           <w:lang w:val="en-US"/>
         </w:rPr>
-        <w:t xml:space="preserve">Before </w:t>
-      </w:r>
-      <w:proofErr w:type="gramStart"/>
-      <w:r>
+        <w:t>Before publish</w:t>
+      </w:r>
+    </w:p>
+    <w:p>
+      <w:pPr>
+        <w:rPr>
+          <w:rFonts w:ascii="Courier New" w:hAnsi="Courier New" w:cs="Courier New"/>
+          <w:lang w:val="en-US"/>
+        </w:rPr>
+      </w:pPr>
+      <w:r>
+        <w:rPr>
+          <w:rFonts w:ascii="Courier New" w:hAnsi="Courier New" w:cs="Courier New"/>
+          <w:lang w:val="en-US"/>
+        </w:rPr>
+        <w:t># Description file of tournament for program squaredeal 2.0.5</w:t>
+      </w:r>
+      <w:r>
+        <w:rPr>
+          <w:rFonts w:ascii="Courier New" w:hAnsi="Courier New" w:cs="Courier New"/>
+          <w:lang w:val="en-US"/>
+        </w:rPr>
+        <w:br/>
+      </w:r>
+      <w:r>
+        <w:rPr>
+          <w:rFonts w:ascii="Courier New" w:hAnsi="Courier New" w:cs="Courier New"/>
+          <w:lang w:val="en-US"/>
+        </w:rPr>
+        <w:t>#</w:t>
+      </w:r>
+      <w:r>
+        <w:rPr>
+          <w:rFonts w:ascii="Courier New" w:hAnsi="Courier New" w:cs="Courier New"/>
+          <w:lang w:val="en-US"/>
+        </w:rPr>
+        <w:br/>
+      </w:r>
+      <w:r>
+        <w:rPr>
+          <w:rFonts w:ascii="Courier New" w:hAnsi="Courier New" w:cs="Courier New"/>
+          <w:lang w:val="en-US"/>
+        </w:rPr>
+        <w:t>TN Test Tournament</w:t>
+      </w:r>
+      <w:r>
+        <w:rPr>
+          <w:rFonts w:ascii="Courier New" w:hAnsi="Courier New" w:cs="Courier New"/>
+          <w:lang w:val="en-US"/>
+        </w:rPr>
+        <w:br/>
+      </w:r>
+      <w:r>
+        <w:rPr>
+          <w:rFonts w:ascii="Courier New" w:hAnsi="Courier New" w:cs="Courier New"/>
+          <w:lang w:val="en-US"/>
+        </w:rPr>
+        <w:t>DI Vatican City August lottery</w:t>
+      </w:r>
+      <w:r>
+        <w:rPr>
+          <w:rFonts w:ascii="Courier New" w:hAnsi="Courier New" w:cs="Courier New"/>
+          <w:lang w:val="en-US"/>
+        </w:rPr>
+        <w:br/>
+      </w:r>
+      <w:r>
+        <w:rPr>
+          <w:rFonts w:ascii="Courier New" w:hAnsi="Courier New" w:cs="Courier New"/>
+          <w:lang w:val="en-US"/>
+        </w:rPr>
+        <w:t># Description of phases of tournament</w:t>
+      </w:r>
+      <w:r>
+        <w:rPr>
+          <w:rFonts w:ascii="Courier New" w:hAnsi="Courier New" w:cs="Courier New"/>
+          <w:lang w:val="en-US"/>
+        </w:rPr>
+        <w:br/>
+      </w:r>
+      <w:r>
+        <w:rPr>
+          <w:rFonts w:ascii="Courier New" w:hAnsi="Courier New" w:cs="Courier New"/>
+          <w:lang w:val="en-US"/>
+        </w:rPr>
+        <w:t># Per phase a line with SN nessions:nboards:filename:description</w:t>
+      </w:r>
+      <w:r>
+        <w:rPr>
+          <w:rFonts w:ascii="Courier New" w:hAnsi="Courier New" w:cs="Courier New"/>
+          <w:lang w:val="en-US"/>
+        </w:rPr>
+        <w:br/>
+      </w:r>
+      <w:r>
+        <w:rPr>
+          <w:rFonts w:ascii="Courier New" w:hAnsi="Courier New" w:cs="Courier New"/>
+          <w:lang w:val="en-US"/>
+        </w:rPr>
+        <w:t>SN 17:1-10,11-20,21-30:round##:round robin #/17</w:t>
+      </w:r>
+      <w:r>
+        <w:rPr>
+          <w:rFonts w:ascii="Courier New" w:hAnsi="Courier New" w:cs="Courier New"/>
+          <w:lang w:val="en-US"/>
+        </w:rPr>
+        <w:br/>
+      </w:r>
+      <w:r>
+        <w:rPr>
+          <w:rFonts w:ascii="Courier New" w:hAnsi="Courier New" w:cs="Courier New"/>
+          <w:lang w:val="en-US"/>
+        </w:rPr>
+        <w:t>SN 4:1-16,17-32:sf#:Semi Finals #/4</w:t>
+      </w:r>
+      <w:r>
+        <w:rPr>
+          <w:rFonts w:ascii="Courier New" w:hAnsi="Courier New" w:cs="Courier New"/>
+          <w:lang w:val="en-US"/>
+        </w:rPr>
+        <w:br/>
+      </w:r>
+      <w:r>
+        <w:rPr>
+          <w:rFonts w:ascii="Courier New" w:hAnsi="Courier New" w:cs="Courier New"/>
+          <w:lang w:val="en-US"/>
+        </w:rPr>
+        <w:t>SN 6:20:fin#:Finals #/6</w:t>
+      </w:r>
+      <w:r>
+        <w:rPr>
+          <w:rFonts w:ascii="Courier New" w:hAnsi="Courier New" w:cs="Courier New"/>
+          <w:lang w:val="en-US"/>
+        </w:rPr>
+        <w:br/>
+      </w:r>
+      <w:r>
+        <w:rPr>
+          <w:rFonts w:ascii="Courier New" w:hAnsi="Courier New" w:cs="Courier New"/>
+          <w:lang w:val="en-US"/>
+        </w:rPr>
+        <w:t>#</w:t>
+      </w:r>
+      <w:r>
+        <w:rPr>
+          <w:rFonts w:ascii="Courier New" w:hAnsi="Courier New" w:cs="Courier New"/>
+          <w:lang w:val="en-US"/>
+        </w:rPr>
+        <w:br/>
+      </w:r>
+      <w:r>
+        <w:rPr>
+          <w:rFonts w:ascii="Courier New" w:hAnsi="Courier New" w:cs="Courier New"/>
+          <w:lang w:val="en-US"/>
+        </w:rPr>
+        <w:t># Until published this file may be edited if so wished</w:t>
+      </w:r>
+    </w:p>
+    <w:p>
+      <w:pPr>
         <w:rPr>
           <w:rFonts w:cstheme="minorHAnsi"/>
           <w:sz w:val="28"/>
           <w:szCs w:val="28"/>
           <w:lang w:val="en-US"/>
         </w:rPr>
-        <w:t>publish</w:t>
-      </w:r>
-      <w:proofErr w:type="gramEnd"/>
-    </w:p>
-    <w:p>
-      <w:pPr>
-        <w:rPr>
-          <w:rFonts w:ascii="Courier New" w:hAnsi="Courier New" w:cs="Courier New"/>
-          <w:lang w:val="en-US"/>
-        </w:rPr>
-      </w:pPr>
-      <w:r>
-        <w:rPr>
-          <w:rFonts w:ascii="Courier New" w:hAnsi="Courier New" w:cs="Courier New"/>
-          <w:lang w:val="en-US"/>
-        </w:rPr>
-        <w:t xml:space="preserve"># Description file of tournament for program </w:t>
-      </w:r>
-      <w:proofErr w:type="spellStart"/>
-      <w:r>
-        <w:rPr>
-          <w:rFonts w:ascii="Courier New" w:hAnsi="Courier New" w:cs="Courier New"/>
-          <w:lang w:val="en-US"/>
-        </w:rPr>
-        <w:t>squaredeal</w:t>
-      </w:r>
-      <w:proofErr w:type="spellEnd"/>
-      <w:r>
-        <w:rPr>
-          <w:rFonts w:ascii="Courier New" w:hAnsi="Courier New" w:cs="Courier New"/>
-          <w:lang w:val="en-US"/>
-        </w:rPr>
-        <w:t xml:space="preserve"> 2.0.5</w:t>
-      </w:r>
-      <w:r>
-        <w:rPr>
-          <w:rFonts w:ascii="Courier New" w:hAnsi="Courier New" w:cs="Courier New"/>
-          <w:lang w:val="en-US"/>
-        </w:rPr>
-        <w:br/>
-      </w:r>
-      <w:r>
-        <w:rPr>
-          <w:rFonts w:ascii="Courier New" w:hAnsi="Courier New" w:cs="Courier New"/>
-          <w:lang w:val="en-US"/>
-        </w:rPr>
-        <w:t>#</w:t>
-      </w:r>
-      <w:r>
-        <w:rPr>
-          <w:rFonts w:ascii="Courier New" w:hAnsi="Courier New" w:cs="Courier New"/>
-          <w:lang w:val="en-US"/>
-        </w:rPr>
-        <w:br/>
-      </w:r>
-      <w:r>
-        <w:rPr>
-          <w:rFonts w:ascii="Courier New" w:hAnsi="Courier New" w:cs="Courier New"/>
-          <w:lang w:val="en-US"/>
-        </w:rPr>
-        <w:t>TN Test Tournament</w:t>
-      </w:r>
-      <w:r>
-        <w:rPr>
-          <w:rFonts w:ascii="Courier New" w:hAnsi="Courier New" w:cs="Courier New"/>
-          <w:lang w:val="en-US"/>
-        </w:rPr>
-        <w:br/>
-      </w:r>
-      <w:r>
-        <w:rPr>
-          <w:rFonts w:ascii="Courier New" w:hAnsi="Courier New" w:cs="Courier New"/>
-          <w:lang w:val="en-US"/>
-        </w:rPr>
-        <w:t>DI Vatican City August lottery</w:t>
-      </w:r>
-      <w:r>
-        <w:rPr>
-          <w:rFonts w:ascii="Courier New" w:hAnsi="Courier New" w:cs="Courier New"/>
-          <w:lang w:val="en-US"/>
-        </w:rPr>
-        <w:br/>
-      </w:r>
-      <w:r>
-        <w:rPr>
-          <w:rFonts w:ascii="Courier New" w:hAnsi="Courier New" w:cs="Courier New"/>
-          <w:lang w:val="en-US"/>
-        </w:rPr>
-        <w:t># Description of phases of tournament</w:t>
-      </w:r>
-      <w:r>
-        <w:rPr>
-          <w:rFonts w:ascii="Courier New" w:hAnsi="Courier New" w:cs="Courier New"/>
-          <w:lang w:val="en-US"/>
-        </w:rPr>
-        <w:br/>
-      </w:r>
-      <w:r>
-        <w:rPr>
-          <w:rFonts w:ascii="Courier New" w:hAnsi="Courier New" w:cs="Courier New"/>
-          <w:lang w:val="en-US"/>
-        </w:rPr>
-        <w:t xml:space="preserve"># Per phase a line with SN </w:t>
-      </w:r>
-      <w:proofErr w:type="spellStart"/>
-      <w:r>
-        <w:rPr>
-          <w:rFonts w:ascii="Courier New" w:hAnsi="Courier New" w:cs="Courier New"/>
-          <w:lang w:val="en-US"/>
-        </w:rPr>
-        <w:t>nessions:nboards:filename:description</w:t>
-      </w:r>
-      <w:proofErr w:type="spellEnd"/>
-      <w:r>
-        <w:rPr>
-          <w:rFonts w:ascii="Courier New" w:hAnsi="Courier New" w:cs="Courier New"/>
-          <w:lang w:val="en-US"/>
-        </w:rPr>
-        <w:br/>
-      </w:r>
-      <w:r>
-        <w:rPr>
-          <w:rFonts w:ascii="Courier New" w:hAnsi="Courier New" w:cs="Courier New"/>
-          <w:lang w:val="en-US"/>
-        </w:rPr>
-        <w:t>SN 17:1-10,11-20,21-30:round##:round robin #/17</w:t>
-      </w:r>
-      <w:r>
-        <w:rPr>
-          <w:rFonts w:ascii="Courier New" w:hAnsi="Courier New" w:cs="Courier New"/>
-          <w:lang w:val="en-US"/>
-        </w:rPr>
-        <w:br/>
-      </w:r>
-      <w:r>
-        <w:rPr>
-          <w:rFonts w:ascii="Courier New" w:hAnsi="Courier New" w:cs="Courier New"/>
-          <w:lang w:val="en-US"/>
-        </w:rPr>
-        <w:t>SN 4:1-16,17-32:sf#:Semi Finals #/4</w:t>
-      </w:r>
-      <w:r>
-        <w:rPr>
-          <w:rFonts w:ascii="Courier New" w:hAnsi="Courier New" w:cs="Courier New"/>
-          <w:lang w:val="en-US"/>
-        </w:rPr>
-        <w:br/>
-      </w:r>
-      <w:r>
-        <w:rPr>
-          <w:rFonts w:ascii="Courier New" w:hAnsi="Courier New" w:cs="Courier New"/>
-          <w:lang w:val="en-US"/>
-        </w:rPr>
-        <w:t>SN 6:20:fin#:Finals #/6</w:t>
-      </w:r>
-      <w:r>
-        <w:rPr>
-          <w:rFonts w:ascii="Courier New" w:hAnsi="Courier New" w:cs="Courier New"/>
-          <w:lang w:val="en-US"/>
-        </w:rPr>
-        <w:br/>
-      </w:r>
-      <w:r>
-        <w:rPr>
-          <w:rFonts w:ascii="Courier New" w:hAnsi="Courier New" w:cs="Courier New"/>
-          <w:lang w:val="en-US"/>
-        </w:rPr>
-        <w:t>#</w:t>
-      </w:r>
-      <w:r>
-        <w:rPr>
-          <w:rFonts w:ascii="Courier New" w:hAnsi="Courier New" w:cs="Courier New"/>
-          <w:lang w:val="en-US"/>
-        </w:rPr>
-        <w:br/>
-      </w:r>
-      <w:r>
-        <w:rPr>
-          <w:rFonts w:ascii="Courier New" w:hAnsi="Courier New" w:cs="Courier New"/>
-          <w:lang w:val="en-US"/>
-        </w:rPr>
-        <w:t># Until published this file may be edited if so wished</w:t>
-      </w:r>
-    </w:p>
-    <w:p>
-      <w:pPr>
+      </w:pPr>
+      <w:r>
         <w:rPr>
           <w:rFonts w:cstheme="minorHAnsi"/>
           <w:sz w:val="28"/>
           <w:szCs w:val="28"/>
           <w:lang w:val="en-US"/>
         </w:rPr>
-      </w:pPr>
-      <w:r>
+        <w:t>After publish</w:t>
+      </w:r>
+    </w:p>
+    <w:p>
+      <w:pPr>
+        <w:rPr>
+          <w:rFonts w:ascii="Courier New" w:hAnsi="Courier New" w:cs="Courier New"/>
+          <w:lang w:val="en-US"/>
+        </w:rPr>
+      </w:pPr>
+      <w:r>
+        <w:rPr>
+          <w:rFonts w:ascii="Courier New" w:hAnsi="Courier New" w:cs="Courier New"/>
+          <w:lang w:val="en-US"/>
+        </w:rPr>
+        <w:t># Description file of tournament for program squaredeal 2.0.5</w:t>
+      </w:r>
+      <w:r>
+        <w:rPr>
+          <w:rFonts w:ascii="Courier New" w:hAnsi="Courier New" w:cs="Courier New"/>
+          <w:lang w:val="en-US"/>
+        </w:rPr>
+        <w:br/>
+      </w:r>
+      <w:r>
+        <w:rPr>
+          <w:rFonts w:ascii="Courier New" w:hAnsi="Courier New" w:cs="Courier New"/>
+          <w:lang w:val="en-US"/>
+        </w:rPr>
+        <w:t>#</w:t>
+      </w:r>
+      <w:r>
+        <w:rPr>
+          <w:rFonts w:ascii="Courier New" w:hAnsi="Courier New" w:cs="Courier New"/>
+          <w:lang w:val="en-US"/>
+        </w:rPr>
+        <w:br/>
+      </w:r>
+      <w:r>
+        <w:rPr>
+          <w:rFonts w:ascii="Courier New" w:hAnsi="Courier New" w:cs="Courier New"/>
+          <w:lang w:val="en-US"/>
+        </w:rPr>
+        <w:t>TN Test Tournament</w:t>
+      </w:r>
+      <w:r>
+        <w:rPr>
+          <w:rFonts w:ascii="Courier New" w:hAnsi="Courier New" w:cs="Courier New"/>
+          <w:lang w:val="en-US"/>
+        </w:rPr>
+        <w:br/>
+      </w:r>
+      <w:r>
+        <w:rPr>
+          <w:rFonts w:ascii="Courier New" w:hAnsi="Courier New" w:cs="Courier New"/>
+          <w:lang w:val="en-US"/>
+        </w:rPr>
+        <w:lastRenderedPageBreak/>
+        <w:t>DI Vatican City August lottery</w:t>
+      </w:r>
+      <w:r>
+        <w:rPr>
+          <w:rFonts w:ascii="Courier New" w:hAnsi="Courier New" w:cs="Courier New"/>
+          <w:lang w:val="en-US"/>
+        </w:rPr>
+        <w:br/>
+      </w:r>
+      <w:r>
+        <w:rPr>
+          <w:rFonts w:ascii="Courier New" w:hAnsi="Courier New" w:cs="Courier New"/>
+          <w:lang w:val="en-US"/>
+        </w:rPr>
+        <w:t># Description of phases of tournament</w:t>
+      </w:r>
+      <w:r>
+        <w:rPr>
+          <w:rFonts w:ascii="Courier New" w:hAnsi="Courier New" w:cs="Courier New"/>
+          <w:lang w:val="en-US"/>
+        </w:rPr>
+        <w:br/>
+      </w:r>
+      <w:r>
+        <w:rPr>
+          <w:rFonts w:ascii="Courier New" w:hAnsi="Courier New" w:cs="Courier New"/>
+          <w:lang w:val="en-US"/>
+        </w:rPr>
+        <w:t># Per phase a line with SN nessions:nboards:filename:description</w:t>
+      </w:r>
+      <w:r>
+        <w:rPr>
+          <w:rFonts w:ascii="Courier New" w:hAnsi="Courier New" w:cs="Courier New"/>
+          <w:lang w:val="en-US"/>
+        </w:rPr>
+        <w:br/>
+      </w:r>
+      <w:r>
+        <w:rPr>
+          <w:rFonts w:ascii="Courier New" w:hAnsi="Courier New" w:cs="Courier New"/>
+          <w:lang w:val="en-US"/>
+        </w:rPr>
+        <w:t>SN 17:1-10,11-20,21-30:round##:round robin #/17</w:t>
+      </w:r>
+      <w:r>
+        <w:rPr>
+          <w:rFonts w:ascii="Courier New" w:hAnsi="Courier New" w:cs="Courier New"/>
+          <w:lang w:val="en-US"/>
+        </w:rPr>
+        <w:br/>
+      </w:r>
+      <w:r>
+        <w:rPr>
+          <w:rFonts w:ascii="Courier New" w:hAnsi="Courier New" w:cs="Courier New"/>
+          <w:lang w:val="en-US"/>
+        </w:rPr>
+        <w:t>SN 4:1-16,17-32:sf#:Semi Finals #/4</w:t>
+      </w:r>
+      <w:r>
+        <w:rPr>
+          <w:rFonts w:ascii="Courier New" w:hAnsi="Courier New" w:cs="Courier New"/>
+          <w:lang w:val="en-US"/>
+        </w:rPr>
+        <w:br/>
+      </w:r>
+      <w:r>
+        <w:rPr>
+          <w:rFonts w:ascii="Courier New" w:hAnsi="Courier New" w:cs="Courier New"/>
+          <w:lang w:val="en-US"/>
+        </w:rPr>
+        <w:t>SN 6:20:fin#:Finals #/6</w:t>
+      </w:r>
+      <w:r>
+        <w:rPr>
+          <w:rFonts w:ascii="Courier New" w:hAnsi="Courier New" w:cs="Courier New"/>
+          <w:lang w:val="en-US"/>
+        </w:rPr>
+        <w:br/>
+      </w:r>
+      <w:r>
+        <w:rPr>
+          <w:rFonts w:ascii="Courier New" w:hAnsi="Courier New" w:cs="Courier New"/>
+          <w:lang w:val="en-US"/>
+        </w:rPr>
+        <w:t>KH 8d00eb6b5b0ae9f99791be42888a8d90005e3745ca206a1bd7690fce486f5132</w:t>
+      </w:r>
+    </w:p>
+    <w:p>
+      <w:pPr>
         <w:rPr>
           <w:rFonts w:cstheme="minorHAnsi"/>
           <w:sz w:val="28"/>
           <w:szCs w:val="28"/>
           <w:lang w:val="en-US"/>
         </w:rPr>
-        <w:t xml:space="preserve">After </w:t>
-      </w:r>
-      <w:proofErr w:type="gramStart"/>
+      </w:pPr>
       <w:r>
         <w:rPr>
           <w:rFonts w:cstheme="minorHAnsi"/>
@@ -4004,39 +3558,22 @@
           <w:szCs w:val="28"/>
           <w:lang w:val="en-US"/>
         </w:rPr>
-        <w:t>publish</w:t>
-      </w:r>
-      <w:proofErr w:type="gramEnd"/>
-    </w:p>
-    <w:p>
-      <w:pPr>
-        <w:rPr>
-          <w:rFonts w:ascii="Courier New" w:hAnsi="Courier New" w:cs="Courier New"/>
-          <w:lang w:val="en-US"/>
-        </w:rPr>
-      </w:pPr>
-      <w:r>
-        <w:rPr>
-          <w:rFonts w:ascii="Courier New" w:hAnsi="Courier New" w:cs="Courier New"/>
-          <w:lang w:val="en-US"/>
-        </w:rPr>
-        <w:t xml:space="preserve"># Description file of tournament for program </w:t>
-      </w:r>
-      <w:proofErr w:type="spellStart"/>
-      <w:r>
-        <w:rPr>
-          <w:rFonts w:ascii="Courier New" w:hAnsi="Courier New" w:cs="Courier New"/>
-          <w:lang w:val="en-US"/>
-        </w:rPr>
-        <w:t>squaredeal</w:t>
-      </w:r>
-      <w:proofErr w:type="spellEnd"/>
-      <w:r>
-        <w:rPr>
-          <w:rFonts w:ascii="Courier New" w:hAnsi="Courier New" w:cs="Courier New"/>
-          <w:lang w:val="en-US"/>
-        </w:rPr>
-        <w:t xml:space="preserve"> 2.0.5</w:t>
+        <w:t>After setting delayed info value</w:t>
+      </w:r>
+    </w:p>
+    <w:p>
+      <w:pPr>
+        <w:rPr>
+          <w:rFonts w:ascii="Courier New" w:hAnsi="Courier New" w:cs="Courier New"/>
+          <w:lang w:val="en-US"/>
+        </w:rPr>
+      </w:pPr>
+      <w:r>
+        <w:rPr>
+          <w:rFonts w:ascii="Courier New" w:hAnsi="Courier New" w:cs="Courier New"/>
+          <w:lang w:val="en-US"/>
+        </w:rPr>
+        <w:t># Description file of tournament for program squaredeal 2.0.5</w:t>
       </w:r>
       <w:r>
         <w:rPr>
@@ -4092,6 +3629,20 @@
           <w:rFonts w:ascii="Courier New" w:hAnsi="Courier New" w:cs="Courier New"/>
           <w:lang w:val="en-US"/>
         </w:rPr>
+        <w:t>DV 3 6 9 13 26 40</w:t>
+      </w:r>
+      <w:r>
+        <w:rPr>
+          <w:rFonts w:ascii="Courier New" w:hAnsi="Courier New" w:cs="Courier New"/>
+          <w:lang w:val="en-US"/>
+        </w:rPr>
+        <w:br/>
+      </w:r>
+      <w:r>
+        <w:rPr>
+          <w:rFonts w:ascii="Courier New" w:hAnsi="Courier New" w:cs="Courier New"/>
+          <w:lang w:val="en-US"/>
+        </w:rPr>
         <w:t># Description of phases of tournament</w:t>
       </w:r>
       <w:r>
@@ -4106,217 +3657,8 @@
           <w:rFonts w:ascii="Courier New" w:hAnsi="Courier New" w:cs="Courier New"/>
           <w:lang w:val="en-US"/>
         </w:rPr>
-        <w:lastRenderedPageBreak/>
-        <w:t xml:space="preserve"># Per phase a line with SN </w:t>
-      </w:r>
-      <w:proofErr w:type="spellStart"/>
-      <w:r>
-        <w:rPr>
-          <w:rFonts w:ascii="Courier New" w:hAnsi="Courier New" w:cs="Courier New"/>
-          <w:lang w:val="en-US"/>
-        </w:rPr>
-        <w:t>nessions:nboards:filename:description</w:t>
-      </w:r>
-      <w:proofErr w:type="spellEnd"/>
-      <w:r>
-        <w:rPr>
-          <w:rFonts w:ascii="Courier New" w:hAnsi="Courier New" w:cs="Courier New"/>
-          <w:lang w:val="en-US"/>
-        </w:rPr>
-        <w:br/>
-      </w:r>
-      <w:r>
-        <w:rPr>
-          <w:rFonts w:ascii="Courier New" w:hAnsi="Courier New" w:cs="Courier New"/>
-          <w:lang w:val="en-US"/>
-        </w:rPr>
-        <w:t>SN 17:1-10,11-20,21-30:round##:round robin #/17</w:t>
-      </w:r>
-      <w:r>
-        <w:rPr>
-          <w:rFonts w:ascii="Courier New" w:hAnsi="Courier New" w:cs="Courier New"/>
-          <w:lang w:val="en-US"/>
-        </w:rPr>
-        <w:br/>
-      </w:r>
-      <w:r>
-        <w:rPr>
-          <w:rFonts w:ascii="Courier New" w:hAnsi="Courier New" w:cs="Courier New"/>
-          <w:lang w:val="en-US"/>
-        </w:rPr>
-        <w:t>SN 4:1-16,17-32:sf#:Semi Finals #/4</w:t>
-      </w:r>
-      <w:r>
-        <w:rPr>
-          <w:rFonts w:ascii="Courier New" w:hAnsi="Courier New" w:cs="Courier New"/>
-          <w:lang w:val="en-US"/>
-        </w:rPr>
-        <w:br/>
-      </w:r>
-      <w:r>
-        <w:rPr>
-          <w:rFonts w:ascii="Courier New" w:hAnsi="Courier New" w:cs="Courier New"/>
-          <w:lang w:val="en-US"/>
-        </w:rPr>
-        <w:t>SN 6:20:fin#:Finals #/6</w:t>
-      </w:r>
-      <w:r>
-        <w:rPr>
-          <w:rFonts w:ascii="Courier New" w:hAnsi="Courier New" w:cs="Courier New"/>
-          <w:lang w:val="en-US"/>
-        </w:rPr>
-        <w:br/>
-      </w:r>
-      <w:r>
-        <w:rPr>
-          <w:rFonts w:ascii="Courier New" w:hAnsi="Courier New" w:cs="Courier New"/>
-          <w:lang w:val="en-US"/>
-        </w:rPr>
-        <w:t>KH 8d00eb6b5b0ae9f99791be42888a8d90005e3745ca206a1bd7690fce486f5132</w:t>
-      </w:r>
-    </w:p>
-    <w:p>
-      <w:pPr>
-        <w:rPr>
-          <w:rFonts w:cstheme="minorHAnsi"/>
-          <w:sz w:val="28"/>
-          <w:szCs w:val="28"/>
-          <w:lang w:val="en-US"/>
-        </w:rPr>
-      </w:pPr>
-      <w:r>
-        <w:rPr>
-          <w:rFonts w:cstheme="minorHAnsi"/>
-          <w:sz w:val="28"/>
-          <w:szCs w:val="28"/>
-          <w:lang w:val="en-US"/>
-        </w:rPr>
-        <w:t>After setting delayed info value</w:t>
-      </w:r>
-    </w:p>
-    <w:p>
-      <w:pPr>
-        <w:rPr>
-          <w:rFonts w:ascii="Courier New" w:hAnsi="Courier New" w:cs="Courier New"/>
-          <w:lang w:val="en-US"/>
-        </w:rPr>
-      </w:pPr>
-      <w:r>
-        <w:rPr>
-          <w:rFonts w:ascii="Courier New" w:hAnsi="Courier New" w:cs="Courier New"/>
-          <w:lang w:val="en-US"/>
-        </w:rPr>
-        <w:t xml:space="preserve"># Description file of tournament for program </w:t>
-      </w:r>
-      <w:proofErr w:type="spellStart"/>
-      <w:r>
-        <w:rPr>
-          <w:rFonts w:ascii="Courier New" w:hAnsi="Courier New" w:cs="Courier New"/>
-          <w:lang w:val="en-US"/>
-        </w:rPr>
-        <w:t>squaredeal</w:t>
-      </w:r>
-      <w:proofErr w:type="spellEnd"/>
-      <w:r>
-        <w:rPr>
-          <w:rFonts w:ascii="Courier New" w:hAnsi="Courier New" w:cs="Courier New"/>
-          <w:lang w:val="en-US"/>
-        </w:rPr>
-        <w:t xml:space="preserve"> 2.0.5</w:t>
-      </w:r>
-      <w:r>
-        <w:rPr>
-          <w:rFonts w:ascii="Courier New" w:hAnsi="Courier New" w:cs="Courier New"/>
-          <w:lang w:val="en-US"/>
-        </w:rPr>
-        <w:br/>
-      </w:r>
-      <w:r>
-        <w:rPr>
-          <w:rFonts w:ascii="Courier New" w:hAnsi="Courier New" w:cs="Courier New"/>
-          <w:lang w:val="en-US"/>
-        </w:rPr>
-        <w:t>#</w:t>
-      </w:r>
-      <w:r>
-        <w:rPr>
-          <w:rFonts w:ascii="Courier New" w:hAnsi="Courier New" w:cs="Courier New"/>
-          <w:lang w:val="en-US"/>
-        </w:rPr>
-        <w:br/>
-      </w:r>
-      <w:r>
-        <w:rPr>
-          <w:rFonts w:ascii="Courier New" w:hAnsi="Courier New" w:cs="Courier New"/>
-          <w:lang w:val="en-US"/>
-        </w:rPr>
-        <w:t>TN Test Tournament</w:t>
-      </w:r>
-      <w:r>
-        <w:rPr>
-          <w:rFonts w:ascii="Courier New" w:hAnsi="Courier New" w:cs="Courier New"/>
-          <w:lang w:val="en-US"/>
-        </w:rPr>
-        <w:br/>
-      </w:r>
-      <w:r>
-        <w:rPr>
-          <w:rFonts w:ascii="Courier New" w:hAnsi="Courier New" w:cs="Courier New"/>
-          <w:lang w:val="en-US"/>
-        </w:rPr>
-        <w:t>DI Vatican City August lottery</w:t>
-      </w:r>
-      <w:r>
-        <w:rPr>
-          <w:rFonts w:ascii="Courier New" w:hAnsi="Courier New" w:cs="Courier New"/>
-          <w:lang w:val="en-US"/>
-        </w:rPr>
-        <w:br/>
-      </w:r>
-      <w:r>
-        <w:rPr>
-          <w:rFonts w:ascii="Courier New" w:hAnsi="Courier New" w:cs="Courier New"/>
-          <w:lang w:val="en-US"/>
-        </w:rPr>
-        <w:t>DV 3 6 9 13 26 40</w:t>
-      </w:r>
-      <w:r>
-        <w:rPr>
-          <w:rFonts w:ascii="Courier New" w:hAnsi="Courier New" w:cs="Courier New"/>
-          <w:lang w:val="en-US"/>
-        </w:rPr>
-        <w:br/>
-      </w:r>
-      <w:r>
-        <w:rPr>
-          <w:rFonts w:ascii="Courier New" w:hAnsi="Courier New" w:cs="Courier New"/>
-          <w:lang w:val="en-US"/>
-        </w:rPr>
-        <w:t># Description of phases of tournament</w:t>
-      </w:r>
-      <w:r>
-        <w:rPr>
-          <w:rFonts w:ascii="Courier New" w:hAnsi="Courier New" w:cs="Courier New"/>
-          <w:lang w:val="en-US"/>
-        </w:rPr>
-        <w:br/>
-      </w:r>
-      <w:r>
-        <w:rPr>
-          <w:rFonts w:ascii="Courier New" w:hAnsi="Courier New" w:cs="Courier New"/>
-          <w:lang w:val="en-US"/>
-        </w:rPr>
-        <w:t xml:space="preserve"># Per phase a line with SN </w:t>
-      </w:r>
-      <w:proofErr w:type="spellStart"/>
-      <w:r>
-        <w:rPr>
-          <w:rFonts w:ascii="Courier New" w:hAnsi="Courier New" w:cs="Courier New"/>
-          <w:lang w:val="en-US"/>
-        </w:rPr>
-        <w:t>nessions:nboards:filename:description</w:t>
-      </w:r>
-      <w:proofErr w:type="spellEnd"/>
+        <w:t># Per phase a line with SN nessions:nboards:filename:description</w:t>
+      </w:r>
       <w:r>
         <w:rPr>
           <w:rFonts w:ascii="Courier New" w:hAnsi="Courier New" w:cs="Courier New"/>
@@ -4391,7 +3733,6 @@
           <w:lang w:val="en-US"/>
         </w:rPr>
       </w:pPr>
-      <w:proofErr w:type="spellStart"/>
       <w:r>
         <w:rPr>
           <w:rFonts w:cstheme="minorHAnsi"/>
@@ -4401,7 +3742,6 @@
         </w:rPr>
         <w:t>Test.sqk</w:t>
       </w:r>
-      <w:proofErr w:type="spellEnd"/>
     </w:p>
     <w:p>
       <w:pPr>
@@ -4737,6 +4077,7 @@
           <w:rFonts w:ascii="Courier New" w:hAnsi="Courier New" w:cs="Courier New"/>
           <w:lang w:val="en-US"/>
         </w:rPr>
+        <w:lastRenderedPageBreak/>
         <w:t>3,3:g3D4qaF8DXNBwvHAY33H7N9wPjGk6DYlF57sJgeAM4D7FKKDVpCzsqsE8vPQ</w:t>
       </w:r>
       <w:r>
@@ -4765,7 +4106,6 @@
           <w:rFonts w:ascii="Courier New" w:hAnsi="Courier New" w:cs="Courier New"/>
           <w:lang w:val="en-US"/>
         </w:rPr>
-        <w:lastRenderedPageBreak/>
         <w:t>3,5:i2brjxIU07w6huFcWMK1obBgR4hvy5e4k4mkkdMJQZLhUWR4FF6kzDruBOoP</w:t>
       </w:r>
       <w:r>
@@ -4795,6 +4135,21 @@
           <w:rFonts w:cstheme="minorHAnsi"/>
           <w:lang w:val="en-US"/>
         </w:rPr>
+        <w:t>If you use unlimited phases the session number is encoded something like 3,0:</w:t>
+      </w:r>
+    </w:p>
+    <w:p>
+      <w:pPr>
+        <w:rPr>
+          <w:rFonts w:cstheme="minorHAnsi"/>
+          <w:lang w:val="en-US"/>
+        </w:rPr>
+      </w:pPr>
+      <w:r>
+        <w:rPr>
+          <w:rFonts w:cstheme="minorHAnsi"/>
+          <w:lang w:val="en-US"/>
+        </w:rPr>
         <w:t xml:space="preserve">For the </w:t>
       </w:r>
       <w:r>
@@ -4830,36 +4185,27 @@
           <w:rFonts w:cstheme="minorHAnsi"/>
           <w:lang w:val="en-US"/>
         </w:rPr>
-        <w:t xml:space="preserve">key </w:t>
-      </w:r>
-      <w:proofErr w:type="gramStart"/>
+        <w:t>key hash</w:t>
+      </w:r>
       <w:r>
         <w:rPr>
           <w:rFonts w:cstheme="minorHAnsi"/>
           <w:lang w:val="en-US"/>
         </w:rPr>
-        <w:t>hash</w:t>
-      </w:r>
-      <w:proofErr w:type="gramEnd"/>
+        <w:t xml:space="preserve"> it is important you do it </w:t>
+      </w:r>
       <w:r>
         <w:rPr>
           <w:rFonts w:cstheme="minorHAnsi"/>
           <w:lang w:val="en-US"/>
         </w:rPr>
-        <w:t xml:space="preserve"> it is important you do it </w:t>
+        <w:t>consistently</w:t>
       </w:r>
       <w:r>
         <w:rPr>
           <w:rFonts w:cstheme="minorHAnsi"/>
           <w:lang w:val="en-US"/>
         </w:rPr>
-        <w:t>consistently</w:t>
-      </w:r>
-      <w:r>
-        <w:rPr>
-          <w:rFonts w:cstheme="minorHAnsi"/>
-          <w:lang w:val="en-US"/>
-        </w:rPr>
         <w:t>. I chose to use the DOS like convention.</w:t>
       </w:r>
     </w:p>
@@ -4889,14 +4235,7 @@
         <w:rPr>
           <w:lang w:val="en-US"/>
         </w:rPr>
-        <w:t xml:space="preserve">This software is handy to use for larger tournaments, even if you are not interested in </w:t>
-      </w:r>
-      <w:proofErr w:type="gramStart"/>
-      <w:r>
-        <w:rPr>
-          <w:lang w:val="en-US"/>
-        </w:rPr>
-        <w:t xml:space="preserve">the </w:t>
+        <w:t xml:space="preserve">This software is handy to use for larger tournaments, even if you are not interested in the </w:t>
       </w:r>
       <w:r>
         <w:rPr>
@@ -4904,16 +4243,7 @@
           <w:iCs/>
           <w:lang w:val="en-US"/>
         </w:rPr>
-        <w:t>proving</w:t>
-      </w:r>
-      <w:proofErr w:type="gramEnd"/>
-      <w:r>
-        <w:rPr>
-          <w:i/>
-          <w:iCs/>
-          <w:lang w:val="en-US"/>
-        </w:rPr>
-        <w:t xml:space="preserve"> innocent</w:t>
+        <w:t>proving innocent</w:t>
       </w:r>
       <w:r>
         <w:rPr>

</xml_diff>